<commit_message>
Session 319: Fix split block quote formatting in DOCX - Allow ** bold markers and / poetry separators in _split_long_hebrew_block separator regex - Add bold-aware run creation in _add_hebrew_block_paragraph - Psalm 45 Hebrew quotations now render as unified block quotes
</commit_message>
<xml_diff>
--- a/Documents/Psalm study guide/Psalm 42.docx
+++ b/Documents/Psalm study guide/Psalm 42.docx
@@ -668,10 +668,10 @@
         <w:pStyle w:val="BodySans"/>
       </w:pPr>
       <w:r>
-        <w:t>Psalm 42 opens with a thirsty animal and closes with a drowning human. The substance is the same in both scenes — water — but somewhere between the opening simile and the final complaint, it stops being what the psalmist needs and becomes what threatens to kill him. That transformation, executed across eleven verses in a single sustained argument, is what makes this poem something more than a beautiful expression of longing. It is a theological claim about the nature of God: the source of life and the sourc</w:t>
-      </w:r>
-      <w:r>
-        <w:t>e of what overwhelms are the same.</w:t>
+        <w:t xml:space="preserve">Psalm 42 opens with a thirsty animal and, before its closing refrain, arrives at a drowning human. The substance is the same in both scenes — water — but somewhere between the opening simile and the final complaint, it stops being what the psalmist needs and becomes what threatens to kill him. That transformation, executed across eleven verses in a single sustained argument, is what makes this poem something more than a beautiful expression of longing. It is a theological claim about the nature of God: the </w:t>
+      </w:r>
+      <w:r>
+        <w:t>source of life and the source of what overwhelms are the same.</w:t>
       </w:r>
     </w:p>
     <w:p>
@@ -777,7 +777,7 @@
         <w:pStyle w:val="BodySans"/>
       </w:pPr>
       <w:r>
-        <w:t xml:space="preserve">This is almost certainly the first panel of a diptych. Psalm 43, which uniquely in Book II lacks a superscription (a heading identifying authorship or genre), shares the same refrain at its close </w:t>
+        <w:t xml:space="preserve">This is almost certainly the first panel of a diptych. Psalm 43, which lacks a superscription (a heading identifying authorship or genre), shares the same refrain at its close </w:t>
       </w:r>
       <w:bdo w:val="ltr">
         <w:r>
@@ -803,87 +803,111 @@
       <w:r>
         <w:t xml:space="preserve">The opening simile looks pastoral until you attend to its specifics. </w:t>
       </w:r>
-      <w:r>
-        <w:t>כְּאַיָּל</w:t>
-      </w:r>
-      <w:r>
-        <w:t xml:space="preserve"> </w:t>
-      </w:r>
-      <w:r>
-        <w:t>תַּעֲרֹג</w:t>
-      </w:r>
-      <w:r>
-        <w:t xml:space="preserve"> </w:t>
-      </w:r>
-      <w:r>
-        <w:t>עַל־אֲפִיקֵי־מָיִם</w:t>
-      </w:r>
-      <w:r>
-        <w:t xml:space="preserve">,‎ 'Like a deer crying for watercourses' (v.2) — the verb </w:t>
-      </w:r>
-      <w:r>
-        <w:t>עָרַג</w:t>
-      </w:r>
-      <w:r>
-        <w:t xml:space="preserve"> occurs in all of Biblical Hebrew only here and in Joel 1:20, where beasts cry out because </w:t>
-      </w:r>
-      <w:r>
-        <w:t>אֲפִיקֵי</w:t>
-      </w:r>
-      <w:r>
-        <w:t xml:space="preserve"> </w:t>
-      </w:r>
-      <w:r>
-        <w:t>מַיִם</w:t>
-      </w:r>
-      <w:r>
-        <w:t xml:space="preserve"> </w:t>
-      </w:r>
-      <w:r>
-        <w:t>יָבֵשׁוּ</w:t>
-      </w:r>
-      <w:r>
-        <w:t xml:space="preserve">,‎ 'the watercourses are dried up.' And the word </w:t>
-      </w:r>
-      <w:r>
-        <w:t>אֲפִיקִים</w:t>
-      </w:r>
-      <w:r>
-        <w:t xml:space="preserve"> does not mean perennial springs. It means stream-beds or channels — places that </w:t>
-      </w:r>
-      <w:r>
-        <w:rPr>
-          <w:i/>
-        </w:rPr>
-        <w:t>should</w:t>
-      </w:r>
-      <w:r>
-        <w:t xml:space="preserve"> carry water but may be empty. The deer seeks water precisely where it normally flows and finds absence. Radak understood this: the deer lives </w:t>
-      </w:r>
-      <w:r>
-        <w:t>בְּמָקוֹם</w:t>
-      </w:r>
-      <w:r>
-        <w:t xml:space="preserve"> </w:t>
-      </w:r>
-      <w:r>
-        <w:t>שֶׁאֵין</w:t>
-      </w:r>
-      <w:r>
-        <w:t xml:space="preserve"> </w:t>
-      </w:r>
-      <w:r>
-        <w:t>מַיִם</w:t>
-      </w:r>
-      <w:r>
-        <w:t xml:space="preserve"> </w:t>
-      </w:r>
-      <w:r>
-        <w:t>מְצוּיָה</w:t>
-      </w:r>
-      <w:r>
-        <w:t>,‎ 'in a place where water is not found.' Its yearning is the yearning of a creature that knows what should be there.‏</w:t>
-      </w:r>
+      <w:bdo w:val="ltr">
+        <w:r>
+          <w:t>םיִמָ־יקֵיפִאֲ־לעַ</w:t>
+        </w:r>
+        <w:r>
+          <w:t xml:space="preserve"> </w:t>
+        </w:r>
+        <w:r>
+          <w:t>גרֹעֲתַּ</w:t>
+        </w:r>
+        <w:r>
+          <w:t xml:space="preserve"> </w:t>
+        </w:r>
+        <w:r>
+          <w:t>ליָּאַכְּ</w:t>
+        </w:r>
+        <w:r>
+          <w:t>‬</w:t>
+        </w:r>
+        <w:r>
+          <w:t xml:space="preserve">, 'Like a deer crying for watercourses' (v.2) — the verb </w:t>
+        </w:r>
+        <w:r>
+          <w:t>עָרַג</w:t>
+        </w:r>
+        <w:r>
+          <w:t xml:space="preserve"> occurs in all of Biblical Hebrew only here and in Joel 1:20, where beasts cry out because </w:t>
+        </w:r>
+        <w:bdo w:val="ltr">
+          <w:r>
+            <w:t>םיִמָ</w:t>
+          </w:r>
+          <w:r>
+            <w:t xml:space="preserve"> </w:t>
+          </w:r>
+          <w:r>
+            <w:t>יקֵיפִאֲ</w:t>
+          </w:r>
+          <w:r>
+            <w:t xml:space="preserve"> </w:t>
+          </w:r>
+          <w:r>
+            <w:t>וּשׁבְיָ</w:t>
+          </w:r>
+          <w:r>
+            <w:t xml:space="preserve"> </w:t>
+          </w:r>
+          <w:r>
+            <w:t>יכִּ</w:t>
+          </w:r>
+          <w:r>
+            <w:t>‬</w:t>
+          </w:r>
+          <w:r>
+            <w:t xml:space="preserve">, 'the watercourses have dried up.' And the word </w:t>
+          </w:r>
+          <w:r>
+            <w:t>אֲפִיקִים</w:t>
+          </w:r>
+          <w:r>
+            <w:t xml:space="preserve"> does not mean perennial springs. It means stream-beds or channels — places that </w:t>
+          </w:r>
+          <w:r>
+            <w:rPr>
+              <w:i/>
+            </w:rPr>
+            <w:t>should</w:t>
+          </w:r>
+          <w:r>
+            <w:t xml:space="preserve"> carry water but may be empty. The deer seeks water precisely where it normally flows and finds absence. Radak understood this: the deer lives </w:t>
+          </w:r>
+          <w:bdo w:val="ltr">
+            <w:r>
+              <w:t>ה</w:t>
+            </w:r>
+            <w:r>
+              <w:t>יָוּצמְ</w:t>
+            </w:r>
+            <w:r>
+              <w:t xml:space="preserve"> </w:t>
+            </w:r>
+            <w:r>
+              <w:t>םיִמַ</w:t>
+            </w:r>
+            <w:r>
+              <w:t xml:space="preserve"> </w:t>
+            </w:r>
+            <w:r>
+              <w:t>ןיאֵשֶׁ</w:t>
+            </w:r>
+            <w:r>
+              <w:t xml:space="preserve"> </w:t>
+            </w:r>
+            <w:r>
+              <w:t>םוֹקמָבְּ</w:t>
+            </w:r>
+            <w:r>
+              <w:t>‬</w:t>
+            </w:r>
+            <w:r>
+              <w:t>, 'in a place where water is not found.' Its yearning is the yearning of a creature that knows what should be there.‏</w:t>
+            </w:r>
+          </w:bdo>
+        </w:bdo>
+      </w:bdo>
     </w:p>
     <w:p>
       <w:pPr>
@@ -892,161 +916,108 @@
       <w:r>
         <w:t xml:space="preserve">What the psalmist thirsts for is equally specific: not comfort, not peace, but </w:t>
       </w:r>
-      <w:r>
-        <w:t>וְאֵרָאֶה</w:t>
-      </w:r>
-      <w:r>
-        <w:t xml:space="preserve"> </w:t>
-      </w:r>
-      <w:r>
-        <w:t>פְּנֵי</w:t>
-      </w:r>
-      <w:r>
-        <w:t xml:space="preserve"> </w:t>
-      </w:r>
-      <w:r>
-        <w:t>אֱלֹקִים</w:t>
-      </w:r>
-      <w:r>
-        <w:t xml:space="preserve">,‎ 'to appear before God's face' (v.3) — the formula for temple pilgrimage (cf. Exod 23:17, where </w:t>
-      </w:r>
-      <w:r>
-        <w:t>שָׁלֹשׁ</w:t>
-      </w:r>
-      <w:r>
-        <w:t xml:space="preserve"> </w:t>
-      </w:r>
-      <w:r>
-        <w:t>פְּעָמִים</w:t>
-      </w:r>
-      <w:r>
-        <w:t xml:space="preserve"> </w:t>
-      </w:r>
-      <w:r>
-        <w:t>בַּשָּׁנָה</w:t>
-      </w:r>
-      <w:r>
-        <w:t xml:space="preserve"> </w:t>
-      </w:r>
-      <w:r>
-        <w:t>יֵרָאֶה</w:t>
-      </w:r>
-      <w:r>
-        <w:t xml:space="preserve"> </w:t>
-      </w:r>
-      <w:r>
-        <w:t>כָּל־זְכוּרְךָ</w:t>
-      </w:r>
-      <w:r>
-        <w:t>,‎ 'three times a year all your males shall appear'). The thirst is spatial and liturgical, not abstract.‏</w:t>
-      </w:r>
+      <w:bdo w:val="ltr">
+        <w:r>
+          <w:t>םיקִלֹאֱ</w:t>
+        </w:r>
+        <w:r>
+          <w:t xml:space="preserve"> </w:t>
+        </w:r>
+        <w:r>
+          <w:t>ינֵפְּ</w:t>
+        </w:r>
+        <w:r>
+          <w:t xml:space="preserve"> </w:t>
+        </w:r>
+        <w:r>
+          <w:t>האֶרָאֵוְ</w:t>
+        </w:r>
+        <w:r>
+          <w:t>‬</w:t>
+        </w:r>
+        <w:r>
+          <w:t>, 'to appear before God's face' (v.3) — the formula for temple pilgrimage (cf. Exod 23:17, where</w:t>
+        </w:r>
+      </w:bdo>
     </w:p>
     <w:p>
       <w:pPr>
         <w:pStyle w:val="BodySans"/>
-      </w:pPr>
-      <w:r>
-        <w:lastRenderedPageBreak/>
-        <w:t xml:space="preserve">Then water turns. In verse 4, </w:t>
-      </w:r>
-      <w:r>
-        <w:t>הָיְתָה</w:t>
-      </w:r>
-      <w:r>
+        <w:bidi/>
+        <w:ind w:left="432" w:right="432"/>
+        <w:jc w:val="right"/>
+      </w:pPr>
+      <w:r>
+        <w:rPr>
+          <w:rFonts w:ascii="Times New Roman" w:hAnsi="Times New Roman"/>
+          <w:sz w:val="26"/>
+          <w:szCs w:val="26"/>
+        </w:rPr>
+        <w:t>שָׁלֹשׁ</w:t>
+      </w:r>
+      <w:r>
+        <w:rPr>
+          <w:rFonts w:ascii="Times New Roman" w:hAnsi="Times New Roman"/>
+          <w:sz w:val="26"/>
+          <w:szCs w:val="26"/>
+        </w:rPr>
         <w:t xml:space="preserve"> </w:t>
       </w:r>
       <w:r>
-        <w:t>לִּי</w:t>
-      </w:r>
-      <w:r>
+        <w:rPr>
+          <w:rFonts w:ascii="Times New Roman" w:hAnsi="Times New Roman"/>
+          <w:sz w:val="26"/>
+          <w:szCs w:val="26"/>
+        </w:rPr>
+        <w:t>פְּעָמִים</w:t>
+      </w:r>
+      <w:r>
+        <w:rPr>
+          <w:rFonts w:ascii="Times New Roman" w:hAnsi="Times New Roman"/>
+          <w:sz w:val="26"/>
+          <w:szCs w:val="26"/>
+        </w:rPr>
         <w:t xml:space="preserve"> </w:t>
       </w:r>
       <w:r>
-        <w:t>דִמְעָתִי</w:t>
-      </w:r>
-      <w:r>
+        <w:rPr>
+          <w:rFonts w:ascii="Times New Roman" w:hAnsi="Times New Roman"/>
+          <w:sz w:val="26"/>
+          <w:szCs w:val="26"/>
+        </w:rPr>
+        <w:t>בַּשָּׁנָה</w:t>
+      </w:r>
+      <w:r>
+        <w:rPr>
+          <w:rFonts w:ascii="Times New Roman" w:hAnsi="Times New Roman"/>
+          <w:sz w:val="26"/>
+          <w:szCs w:val="26"/>
+        </w:rPr>
         <w:t xml:space="preserve"> </w:t>
       </w:r>
       <w:r>
-        <w:t>לֶחֶם</w:t>
-      </w:r>
-      <w:r>
-        <w:t xml:space="preserve">,‎ 'my tears have been my bread' — no comparative particle </w:t>
-      </w:r>
-      <w:r>
-        <w:t>כְּ</w:t>
-      </w:r>
-      <w:r>
-        <w:t xml:space="preserve">,‎ no 'like,' just direct equation. Tears </w:t>
-      </w:r>
-      <w:r>
-        <w:rPr>
-          <w:i/>
-        </w:rPr>
-        <w:t>are</w:t>
-      </w:r>
-      <w:r>
-        <w:t xml:space="preserve"> food. The body's grief-liquid replaces nourishment. By verse 5, the psalmist declares </w:t>
-      </w:r>
-      <w:r>
-        <w:t>אֶשְׁפְּכָה</w:t>
-      </w:r>
-      <w:r>
+        <w:rPr>
+          <w:rFonts w:ascii="Times New Roman" w:hAnsi="Times New Roman"/>
+          <w:sz w:val="26"/>
+          <w:szCs w:val="26"/>
+        </w:rPr>
+        <w:t>יֵרָאֶה</w:t>
+      </w:r>
+      <w:r>
+        <w:rPr>
+          <w:rFonts w:ascii="Times New Roman" w:hAnsi="Times New Roman"/>
+          <w:sz w:val="26"/>
+          <w:szCs w:val="26"/>
+        </w:rPr>
         <w:t xml:space="preserve"> </w:t>
       </w:r>
       <w:r>
-        <w:t>עָלַי</w:t>
-      </w:r>
-      <w:r>
-        <w:t xml:space="preserve"> </w:t>
-      </w:r>
-      <w:r>
-        <w:t>נַפְשִׁי</w:t>
-      </w:r>
-      <w:r>
-        <w:t xml:space="preserve">,‎ 'I pour out my soul upon myself,' which is reflexively strange. Normally one pours out the soul </w:t>
-      </w:r>
-      <w:r>
-        <w:rPr>
-          <w:i/>
-        </w:rPr>
-        <w:t>before God</w:t>
-      </w:r>
-      <w:r>
-        <w:t xml:space="preserve">, as Hannah does in 1 Samuel 1:15: </w:t>
-      </w:r>
-      <w:r>
-        <w:t>שָׁפַכְתִּי</w:t>
-      </w:r>
-      <w:r>
-        <w:t xml:space="preserve"> </w:t>
-      </w:r>
-      <w:r>
-        <w:t>אֶת</w:t>
-      </w:r>
-      <w:r>
-        <w:t xml:space="preserve"> </w:t>
-      </w:r>
-      <w:r>
-        <w:t>נַפְשִׁי</w:t>
-      </w:r>
-      <w:r>
-        <w:t xml:space="preserve"> </w:t>
-      </w:r>
-      <w:r>
-        <w:t>לִפְנֵי</w:t>
-      </w:r>
-      <w:r>
-        <w:t xml:space="preserve"> </w:t>
-      </w:r>
-      <w:r>
-        <w:t>ה׳</w:t>
-      </w:r>
-      <w:r>
-        <w:t>,‎ 'I have poured out my soul before YHWH.' Here the pouring turns inward — an interi</w:t>
-      </w:r>
-      <w:r>
-        <w:t>or flood with nowhere to go.‏</w:t>
+        <w:rPr>
+          <w:rFonts w:ascii="Times New Roman" w:hAnsi="Times New Roman"/>
+          <w:sz w:val="26"/>
+          <w:szCs w:val="26"/>
+        </w:rPr>
+        <w:t>כָּל־זְכוּרְךָ</w:t>
       </w:r>
     </w:p>
     <w:p>
@@ -1054,76 +1025,8 @@
         <w:pStyle w:val="BodySans"/>
       </w:pPr>
       <w:r>
-        <w:t xml:space="preserve">The transformation reaches its nadir at verse 8: </w:t>
-      </w:r>
-      <w:r>
-        <w:t>תְּהוֹם</w:t>
-      </w:r>
-      <w:r>
-        <w:t xml:space="preserve"> </w:t>
-      </w:r>
-      <w:r>
-        <w:t>אֶל</w:t>
-      </w:r>
-      <w:r>
-        <w:t xml:space="preserve"> </w:t>
-      </w:r>
-      <w:r>
-        <w:t>תְּהוֹם</w:t>
-      </w:r>
-      <w:r>
-        <w:t xml:space="preserve"> </w:t>
-      </w:r>
-      <w:r>
-        <w:t>קוֹרֵא</w:t>
-      </w:r>
-      <w:r>
-        <w:t xml:space="preserve">,‎ 'deep calls to deep.' The word </w:t>
-      </w:r>
-      <w:r>
-        <w:t>תְּהוֹם</w:t>
-      </w:r>
-      <w:r>
-        <w:t xml:space="preserve"> appears without the definite article, exactly as in Genesis 1:2 (</w:t>
-      </w:r>
-      <w:r>
-        <w:t>וְחֹשֶׁךְ</w:t>
-      </w:r>
-      <w:r>
-        <w:t xml:space="preserve"> </w:t>
-      </w:r>
-      <w:r>
-        <w:t>עַל־פְּנֵי</w:t>
-      </w:r>
-      <w:r>
-        <w:t xml:space="preserve"> </w:t>
-      </w:r>
-      <w:r>
-        <w:t>תְהוֹם</w:t>
-      </w:r>
-      <w:r>
-        <w:t xml:space="preserve">,‎ 'and darkness upon the face of the deep'), and for the same reason: this is primordial, pre-creation chaos, not a domesticated lake. Three consecutive possessive suffixes — </w:t>
-      </w:r>
-      <w:r>
-        <w:t>צִנּוֹרֶיךָ</w:t>
-      </w:r>
-      <w:r>
-        <w:t xml:space="preserve">,‎ 'Your cataracts'; </w:t>
-      </w:r>
-      <w:r>
-        <w:t>מִשְׁבָּרֶיךָ</w:t>
-      </w:r>
-      <w:r>
-        <w:t xml:space="preserve">,‎ 'Your breakers'; </w:t>
-      </w:r>
-      <w:r>
-        <w:t>גַלֶּיךָ</w:t>
-      </w:r>
-      <w:r>
-        <w:t>,‎ 'Your waves' — assign the drowning unambiguously to God. In Canaanite mythology, the sea was an inde</w:t>
-      </w:r>
-      <w:r>
-        <w:t>pendent hostile deity, Yamm, whom Baal subdued. The psalmist grants chaos no such autonomy: these waters belong to the same God named in verse 3 as 'the living God.'</w:t>
+        <w:lastRenderedPageBreak/>
+        <w:t>'three times a year all your males shall appear'). The thirst is spatial and liturgical, not abstract.</w:t>
       </w:r>
     </w:p>
     <w:p>
@@ -1131,128 +1034,265 @@
         <w:pStyle w:val="BodySans"/>
       </w:pPr>
       <w:r>
-        <w:t xml:space="preserve">There is a geographical irony here that most readers miss. Verse 7 places the psalmist </w:t>
-      </w:r>
-      <w:r>
-        <w:t>מֵאֶרֶץ</w:t>
-      </w:r>
-      <w:r>
-        <w:t xml:space="preserve"> </w:t>
-      </w:r>
-      <w:r>
-        <w:t>יַרְדֵּן</w:t>
-      </w:r>
-      <w:r>
-        <w:t xml:space="preserve"> </w:t>
-      </w:r>
-      <w:r>
-        <w:t>וְחֶרְמוֹנִים</w:t>
-      </w:r>
-      <w:r>
-        <w:t xml:space="preserve">,‎ 'in the land of Jordan and the Hermons.' Mount Hermon's snowmelt feeds the Jordan headwaters through dramatic cataracts near Banias and Dan — a plausible physical backdrop for the waterfalls and breakers of verse 8. The psalmist </w:t>
-      </w:r>
-      <w:r>
-        <w:rPr>
-          <w:i/>
-        </w:rPr>
-        <w:t>hears</w:t>
-      </w:r>
-      <w:r>
-        <w:t xml:space="preserve"> actual water thundering around him, and that physical roar becomes theological metaphor. In the Ugaritic texts discovered at Ras Shamra (ancient tablets from coastal Syria, our primary witness to Canaanite religion), the high god El dwells </w:t>
-      </w:r>
-      <w:r>
-        <w:rPr>
-          <w:i/>
-        </w:rPr>
-        <w:t xml:space="preserve">mbk </w:t>
-      </w:r>
-      <w:r>
-        <w:rPr>
-          <w:i/>
-        </w:rPr>
-        <w:t>nhrm / b ʿdt thmtm</w:t>
-      </w:r>
-      <w:r>
-        <w:t>, 'at the source of the two rivers, at the confluence of the two deeps.' The association helps explain how river-source geography could suggest divine dwelling in the wider ancient Near East. The psalmist stands in such terrain and feels utterly excluded. He is at God's doorstep and cannot get in.</w:t>
-      </w:r>
+        <w:t xml:space="preserve">Then water turns. In verse 4, </w:t>
+      </w:r>
+      <w:bdo w:val="ltr">
+        <w:r>
+          <w:t>םחֶלֶ</w:t>
+        </w:r>
+        <w:r>
+          <w:t xml:space="preserve"> </w:t>
+        </w:r>
+        <w:r>
+          <w:t>יתִעָמְדִ</w:t>
+        </w:r>
+        <w:r>
+          <w:t xml:space="preserve"> </w:t>
+        </w:r>
+        <w:r>
+          <w:t>ילִּ</w:t>
+        </w:r>
+        <w:r>
+          <w:t xml:space="preserve"> </w:t>
+        </w:r>
+        <w:r>
+          <w:t>התָיְהָ</w:t>
+        </w:r>
+        <w:r>
+          <w:t>‬</w:t>
+        </w:r>
+        <w:r>
+          <w:t xml:space="preserve">, 'my tears have been my bread' — no comparative particle </w:t>
+        </w:r>
+        <w:r>
+          <w:t>כְּ</w:t>
+        </w:r>
+        <w:r>
+          <w:t xml:space="preserve">,‎ no 'like,' just direct equation. Tears </w:t>
+        </w:r>
+        <w:r>
+          <w:rPr>
+            <w:i/>
+          </w:rPr>
+          <w:t>are</w:t>
+        </w:r>
+        <w:r>
+          <w:t xml:space="preserve"> food. The body's grief-liquid replaces nourishment. By verse 5, the psalmist declares </w:t>
+        </w:r>
+        <w:bdo w:val="ltr">
+          <w:r>
+            <w:t>ישִׁפְנַ</w:t>
+          </w:r>
+          <w:r>
+            <w:t xml:space="preserve"> </w:t>
+          </w:r>
+          <w:r>
+            <w:t>ילַעָ</w:t>
+          </w:r>
+          <w:r>
+            <w:t xml:space="preserve"> </w:t>
+          </w:r>
+          <w:r>
+            <w:t>הכָפְּשְׁאֶ</w:t>
+          </w:r>
+          <w:r>
+            <w:t>‬</w:t>
+          </w:r>
+          <w:r>
+            <w:t xml:space="preserve">, 'I pour out my soul upon myself,' which is reflexively strange. Normally one pours out the soul </w:t>
+          </w:r>
+          <w:r>
+            <w:rPr>
+              <w:i/>
+            </w:rPr>
+            <w:t>before God</w:t>
+          </w:r>
+          <w:r>
+            <w:t xml:space="preserve">, as Hannah does in 1 Samuel 1:15: </w:t>
+          </w:r>
+          <w:bdo w:val="ltr">
+            <w:r>
+              <w:t>׳ה</w:t>
+            </w:r>
+            <w:r>
+              <w:t xml:space="preserve"> </w:t>
+            </w:r>
+            <w:r>
+              <w:t>ינֵפְלִ</w:t>
+            </w:r>
+            <w:r>
+              <w:t xml:space="preserve"> </w:t>
+            </w:r>
+            <w:r>
+              <w:t>ישִׁפְנַ־תאֶ</w:t>
+            </w:r>
+            <w:r>
+              <w:t xml:space="preserve"> </w:t>
+            </w:r>
+            <w:r>
+              <w:t>ךְפֹּשְׁאֶוָ</w:t>
+            </w:r>
+            <w:r>
+              <w:t>‬</w:t>
+            </w:r>
+            <w:r>
+              <w:t>, 'I have poured out my soul before YHWH.' Here the pouring turns inward — an in</w:t>
+            </w:r>
+            <w:r>
+              <w:t>terior flood with nowhere to go.‏</w:t>
+            </w:r>
+          </w:bdo>
+        </w:bdo>
+      </w:bdo>
     </w:p>
     <w:p>
       <w:pPr>
-        <w:pStyle w:val="Heading3"/>
-      </w:pPr>
-      <w:r>
-        <w:t>The Refrain's Only Movement</w:t>
-      </w:r>
+        <w:pStyle w:val="BodySans"/>
+      </w:pPr>
+      <w:r>
+        <w:t xml:space="preserve">The transformation reaches its nadir at verse 8: </w:t>
+      </w:r>
+      <w:bdo w:val="ltr">
+        <w:r>
+          <w:t>ארֵוֹק</w:t>
+        </w:r>
+        <w:r>
+          <w:t xml:space="preserve"> </w:t>
+        </w:r>
+        <w:r>
+          <w:t>םוֹהתְּ</w:t>
+        </w:r>
+        <w:r>
+          <w:t xml:space="preserve"> </w:t>
+        </w:r>
+        <w:r>
+          <w:t>לאֶ</w:t>
+        </w:r>
+        <w:r>
+          <w:t xml:space="preserve"> </w:t>
+        </w:r>
+        <w:r>
+          <w:t>םוֹהתְּ</w:t>
+        </w:r>
+        <w:r>
+          <w:t>‬</w:t>
+        </w:r>
+        <w:r>
+          <w:t xml:space="preserve">, 'deep calls to deep.' The word </w:t>
+        </w:r>
+        <w:r>
+          <w:t>תְּהוֹם</w:t>
+        </w:r>
+        <w:r>
+          <w:t xml:space="preserve"> appears without the definite article, exactly as in Genesis 1:2 (</w:t>
+        </w:r>
+        <w:bdo w:val="ltr">
+          <w:r>
+            <w:t>םוֹהתְ</w:t>
+          </w:r>
+          <w:r>
+            <w:t xml:space="preserve"> </w:t>
+          </w:r>
+          <w:r>
+            <w:t>ינֵפְּ־לעַ</w:t>
+          </w:r>
+          <w:r>
+            <w:t xml:space="preserve"> </w:t>
+          </w:r>
+          <w:r>
+            <w:t>ךְשֶׁחֹוְ</w:t>
+          </w:r>
+          <w:r>
+            <w:t>‬</w:t>
+          </w:r>
+          <w:r>
+            <w:t xml:space="preserve">, 'and darkness upon the face of the deep'), and for the same reason: this is primordial, pre-creation chaos, not a domesticated lake. Three consecutive possessive suffixes — </w:t>
+          </w:r>
+          <w:r>
+            <w:t>צִנּוֹרֶיךָ</w:t>
+          </w:r>
+          <w:r>
+            <w:t xml:space="preserve">,‎ 'Your cataracts'; </w:t>
+          </w:r>
+          <w:r>
+            <w:t>מִשְׁבָּרֶיךָ</w:t>
+          </w:r>
+          <w:r>
+            <w:t xml:space="preserve">,‎ 'Your breakers'; </w:t>
+          </w:r>
+          <w:r>
+            <w:t>גַלֶּיךָ</w:t>
+          </w:r>
+          <w:r>
+            <w:t>,‎ 'Your waves' — assign the drowning unambiguously to God. In Canaanite mythology, the sea was an in</w:t>
+          </w:r>
+          <w:r>
+            <w:t>dependent hostile deity, Yamm, whom Baal subdued. The psalmist grants chaos no such autonomy: these waters belong to the same God named in verse 3 as 'the living God.'</w:t>
+          </w:r>
+        </w:bdo>
+      </w:bdo>
     </w:p>
     <w:p>
       <w:pPr>
         <w:pStyle w:val="BodySans"/>
       </w:pPr>
       <w:r>
-        <w:t xml:space="preserve">Between the two enemy taunts that bracket the psalm's center — </w:t>
-      </w:r>
-      <w:r>
-        <w:t>אַיֵּה</w:t>
-      </w:r>
-      <w:r>
-        <w:t xml:space="preserve"> </w:t>
-      </w:r>
-      <w:r>
-        <w:t>אֱלֹקֶיךָ</w:t>
-      </w:r>
-      <w:r>
-        <w:t xml:space="preserve">,‎ 'Where is your God?' (vv.4, 11) — the refrain intervenes twice, and the two iterations are not copies. In verse 6, the psalmist ends with </w:t>
-      </w:r>
-      <w:r>
-        <w:t>יְשׁוּעוֹת</w:t>
-      </w:r>
-      <w:r>
-        <w:t xml:space="preserve"> </w:t>
-      </w:r>
-      <w:r>
-        <w:t>פָּנָיו</w:t>
-      </w:r>
-      <w:r>
-        <w:t xml:space="preserve">,‎ 'salvations of His face' — third person, grammatically distant. God has just been addressed as 'You' (vv.2–3), but at the moment of attempted hope, He becomes 'Him.' In verse 12, the pronoun shifts: </w:t>
-      </w:r>
-      <w:r>
-        <w:t>יְשׁוּעֹת</w:t>
-      </w:r>
-      <w:r>
-        <w:t xml:space="preserve"> </w:t>
-      </w:r>
-      <w:r>
-        <w:t>פָּנַי</w:t>
-      </w:r>
-      <w:r>
-        <w:t xml:space="preserve"> </w:t>
-      </w:r>
-      <w:r>
-        <w:t>וֵאלֹקָי</w:t>
-      </w:r>
-      <w:r>
-        <w:t>,‎ 'salvations of my face and my God.' First person. Possessive. The LXX (the ancient Greek translation, or Se</w:t>
-      </w:r>
-      <w:r>
-        <w:t>ptuagint) harmonizes both refrains to the first person, erasing the difference. The MT (the Masoretic Text, the standard Hebrew text) preserves it.‏</w:t>
-      </w:r>
+        <w:t xml:space="preserve">There is a geographical irony here that most readers miss. Verse 7 places the psalmist </w:t>
+      </w:r>
+      <w:bdo w:val="ltr">
+        <w:r>
+          <w:t>םינִוֹמרְחֶוְ</w:t>
+        </w:r>
+        <w:r>
+          <w:t xml:space="preserve"> </w:t>
+        </w:r>
+        <w:r>
+          <w:t>ןדֵּרְיַ</w:t>
+        </w:r>
+        <w:r>
+          <w:t xml:space="preserve"> </w:t>
+        </w:r>
+        <w:r>
+          <w:t>ץרֶאֶמֵ</w:t>
+        </w:r>
+        <w:r>
+          <w:t>‬</w:t>
+        </w:r>
+        <w:r>
+          <w:t xml:space="preserve">, 'in the land of Jordan and the Hermons.' Mount Hermon's snowmelt feeds the Jordan headwaters through dramatic cataracts near Banias and Dan — a plausible physical backdrop for the waterfalls and breakers of verse 8. The psalmist </w:t>
+        </w:r>
+        <w:r>
+          <w:rPr>
+            <w:i/>
+          </w:rPr>
+          <w:t>hears</w:t>
+        </w:r>
+        <w:r>
+          <w:t xml:space="preserve"> actual water thundering around him, and that physical roar becomes theological metaphor. In the Ugaritic texts discovered at Ras Shamra (ancient tablets from coastal Syria, our primary witness to Canaanite religion), the high god El dwells </w:t>
+        </w:r>
+        <w:r>
+          <w:rPr>
+            <w:i/>
+          </w:rPr>
+          <w:t>mbk</w:t>
+        </w:r>
+        <w:r>
+          <w:rPr>
+            <w:i/>
+          </w:rPr>
+          <w:t xml:space="preserve"> nhrm / b ʿdt thmtm</w:t>
+        </w:r>
+        <w:r>
+          <w:t>, 'at the source of the two rivers, at the confluence of the two deeps.' The association helps explain how river-source geography could suggest divine dwelling in the wider ancient Near East. The psalmist stands in such terrain and feels utterly excluded. He is at God's doorstep and cannot get in.</w:t>
+        </w:r>
+      </w:bdo>
     </w:p>
     <w:p>
       <w:pPr>
-        <w:pStyle w:val="BodySans"/>
-      </w:pPr>
-      <w:r>
-        <w:t xml:space="preserve">This is the psalm's only measurable theological progression, and it moves in a counterintuitive direction. The possessive claim on God — </w:t>
-      </w:r>
-      <w:r>
-        <w:t>וֵאלֹקָי</w:t>
-      </w:r>
-      <w:r>
-        <w:t xml:space="preserve">,‎ 'and my God' — emerges </w:t>
-      </w:r>
-      <w:r>
-        <w:lastRenderedPageBreak/>
-        <w:t>not at a moment of closeness but after the chaos-waters and the bone-crushing taunt. As Malbim read it, the refrain stages an argument between the rational mind and the despairing soul. But the pronominal shift suggests something deeper: the psalmist does not arrive at 'my God' through resolution of doubt. He arrives there by insisting on the relationship precisely when all evidence argues against it.‏</w:t>
+        <w:pStyle w:val="Heading3"/>
+      </w:pPr>
+      <w:r>
+        <w:t>The Refrain's Only Movement</w:t>
       </w:r>
     </w:p>
     <w:p>
@@ -1260,168 +1300,246 @@
         <w:pStyle w:val="BodySans"/>
       </w:pPr>
       <w:r>
-        <w:t xml:space="preserve">This is why the psalm ends with a </w:t>
-      </w:r>
-      <w:r>
-        <w:rPr>
-          <w:i/>
-        </w:rPr>
-        <w:t>petu</w:t>
-      </w:r>
-      <w:r>
-        <w:rPr>
-          <w:i/>
-        </w:rPr>
-        <w:t>ḥ</w:t>
-      </w:r>
-      <w:r>
-        <w:rPr>
-          <w:i/>
-        </w:rPr>
-        <w:t>ah</w:t>
-      </w:r>
-      <w:r>
-        <w:t xml:space="preserve"> (an open paragraph marker in the Hebrew manuscript tradition) rather than with praise. The ending is structurally open — held breath, not exhalation. If Psalms 42 and 43 form a single composition, resolution comes in 43:3–4, where </w:t>
-      </w:r>
-      <w:r>
-        <w:t>אוֹרְךָ</w:t>
+        <w:t xml:space="preserve">Between the two enemy taunts that bracket the psalm's center — </w:t>
+      </w:r>
+      <w:r>
+        <w:t>אַיֵּה</w:t>
       </w:r>
       <w:r>
         <w:t xml:space="preserve"> </w:t>
       </w:r>
       <w:r>
-        <w:t>וַאֲמִתְּךָ</w:t>
-      </w:r>
-      <w:r>
-        <w:t>,‎ 'Your light and Your truth,' finally lead the psalmist to the altar. But Psalm 42 alone refuses that closure.‏</w:t>
-      </w:r>
+        <w:t>אֱלֹקֶיךָ</w:t>
+      </w:r>
+      <w:r>
+        <w:t xml:space="preserve">,‎ 'Where is your God?' (vv.4, 11) — the refrain intervenes twice, and the two iterations are not copies. In verse 6, the psalmist ends with </w:t>
+      </w:r>
+      <w:r>
+        <w:t>יְשׁוּעוֹת</w:t>
+      </w:r>
+      <w:r>
+        <w:t xml:space="preserve"> </w:t>
+      </w:r>
+      <w:r>
+        <w:t>פָּנָיו</w:t>
+      </w:r>
+      <w:r>
+        <w:t xml:space="preserve">,‎ 'salvations of His face' — third person, grammatically distant. God has just been addressed as 'You' (vv.2–3), but at the moment of attempted hope, He becomes 'Him.' In verse 12, the pronoun shifts: </w:t>
+      </w:r>
+      <w:bdo w:val="ltr">
+        <w:r>
+          <w:t>יקָלֹאוֵ</w:t>
+        </w:r>
+        <w:r>
+          <w:t xml:space="preserve"> </w:t>
+        </w:r>
+        <w:r>
+          <w:t>ינַפָּ</w:t>
+        </w:r>
+        <w:r>
+          <w:t xml:space="preserve"> </w:t>
+        </w:r>
+        <w:r>
+          <w:t>תעֹוּשׁיְ</w:t>
+        </w:r>
+        <w:r>
+          <w:t>‬</w:t>
+        </w:r>
+        <w:r>
+          <w:t>, 'salvations of my face and my God.' First person. Possessive. The LXX (the ancient Greek translation, or S</w:t>
+        </w:r>
+        <w:r>
+          <w:t>eptuagint) harmonizes both refrains to the first person, erasing the difference. The MT (the Masoretic Text, the standard Hebrew text) preserves it.‏</w:t>
+        </w:r>
+      </w:bdo>
     </w:p>
     <w:p>
       <w:pPr>
         <w:pStyle w:val="BodySans"/>
       </w:pPr>
       <w:r>
-        <w:t xml:space="preserve">The Yom Kippur liturgy understood this refusal. The great piyyut (liturgical poem) </w:t>
-      </w:r>
-      <w:r>
-        <w:t>אֵלֶּה</w:t>
-      </w:r>
-      <w:r>
-        <w:t xml:space="preserve"> </w:t>
-      </w:r>
-      <w:r>
-        <w:t>אֶזְכְּרָה</w:t>
-      </w:r>
-      <w:r>
-        <w:t xml:space="preserve">,‎ 'These things I remember,' which introduces the account of the Ten Martyrs in the Ashkenazic Musaf, takes its opening directly from verse 5: </w:t>
-      </w:r>
-      <w:r>
-        <w:t>אֵלֶּה</w:t>
-      </w:r>
-      <w:r>
-        <w:t xml:space="preserve"> </w:t>
-      </w:r>
-      <w:r>
-        <w:t>אֶזְכְּרָה</w:t>
-      </w:r>
-      <w:r>
-        <w:t xml:space="preserve"> </w:t>
-      </w:r>
-      <w:r>
-        <w:t>וְנַפְשִׁי</w:t>
-      </w:r>
-      <w:r>
-        <w:t xml:space="preserve"> </w:t>
-      </w:r>
-      <w:r>
-        <w:t>עָלַי</w:t>
-      </w:r>
-      <w:r>
-        <w:t xml:space="preserve"> </w:t>
-      </w:r>
-      <w:r>
-        <w:t>אֶשְׁפְּכָה</w:t>
-      </w:r>
-      <w:r>
-        <w:t>,‎ 'These things I remember, and I pour out my soul upon myself.' The liturgists heard in Psalm 42 not a resolved confession of faith but a template for remembering catastrophe while continuing to pray. That is the psalm's lasting discipline: not the assurance that the water will come, but the refusal to</w:t>
-      </w:r>
-      <w:r>
-        <w:t xml:space="preserve"> stop crying for it.‏</w:t>
+        <w:lastRenderedPageBreak/>
+        <w:t xml:space="preserve">This is the psalm's only measurable theological progression, and it moves in a counterintuitive direction. The possessive claim on God — </w:t>
+      </w:r>
+      <w:r>
+        <w:t>וֵאלֹקָי</w:t>
+      </w:r>
+      <w:r>
+        <w:t>,‎ 'and my God' — emerges not at a moment of closeness but after the chaos-waters and the bone-crushing taunt. As Malbim read it, the refrain stages an argument between the rational mind and the despairing soul. But the pronominal shift suggests something deeper: the psalmist does not arrive at 'my God' through resolution of doubt. He arrives there by insisting on the relationship precisely when all evidence argues against it.‏</w:t>
       </w:r>
     </w:p>
     <w:p>
       <w:pPr>
-        <w:pStyle w:val="Heading2"/>
-      </w:pPr>
-      <w:r>
-        <w:t>Modern Jewish Liturgical Use</w:t>
+        <w:pStyle w:val="BodySans"/>
+      </w:pPr>
+      <w:r>
+        <w:t xml:space="preserve">This is why the psalm ends with a </w:t>
+      </w:r>
+      <w:r>
+        <w:rPr>
+          <w:i/>
+        </w:rPr>
+        <w:t>petu</w:t>
+      </w:r>
+      <w:r>
+        <w:rPr>
+          <w:i/>
+        </w:rPr>
+        <w:t>ḥ</w:t>
+      </w:r>
+      <w:r>
+        <w:rPr>
+          <w:i/>
+        </w:rPr>
+        <w:t>ah</w:t>
+      </w:r>
+      <w:r>
+        <w:t xml:space="preserve"> (an open paragraph marker in the Hebrew manuscript tradition) rather than with praise. The ending is structurally open — held breath, not exhalation. If Psalms 42 and 43 form a single composition, resolution comes in 43:3–4, where </w:t>
+      </w:r>
+      <w:r>
+        <w:t>אוֹרְךָ</w:t>
+      </w:r>
+      <w:r>
+        <w:t xml:space="preserve"> </w:t>
+      </w:r>
+      <w:r>
+        <w:t>וַאֲמִתְּךָ</w:t>
+      </w:r>
+      <w:r>
+        <w:t>,‎ 'Your light and Your truth,' finally lead the psalmist to the altar. But Psalm 42 alone refuses that closure.‏</w:t>
       </w:r>
     </w:p>
     <w:p>
       <w:pPr>
-        <w:pStyle w:val="Heading4"/>
-      </w:pPr>
-      <w:r>
-        <w:t>Full Psalm Recitation</w:t>
-      </w:r>
+        <w:pStyle w:val="BodySans"/>
+      </w:pPr>
+      <w:r>
+        <w:t xml:space="preserve">The Yom Kippur liturgy understood this refusal. The great piyyut (liturgical poem) </w:t>
+      </w:r>
+      <w:r>
+        <w:t>אֵלֶּה</w:t>
+      </w:r>
+      <w:r>
+        <w:t xml:space="preserve"> </w:t>
+      </w:r>
+      <w:r>
+        <w:t>אֶזְכְּרָה</w:t>
+      </w:r>
+      <w:r>
+        <w:t xml:space="preserve">,‎ 'These things I remember,' which introduces the account of the Ten Martyrs in the Ashkenazic Musaf, takes its opening directly from verse 5: </w:t>
+      </w:r>
+      <w:bdo w:val="ltr">
+        <w:r>
+          <w:t>הכָפְּשְׁאֶ</w:t>
+        </w:r>
+        <w:r>
+          <w:t xml:space="preserve"> </w:t>
+        </w:r>
+        <w:r>
+          <w:t>ילַעָ</w:t>
+        </w:r>
+        <w:r>
+          <w:t xml:space="preserve"> </w:t>
+        </w:r>
+        <w:r>
+          <w:t>ישִׁפְנַוְ</w:t>
+        </w:r>
+        <w:r>
+          <w:t xml:space="preserve"> </w:t>
+        </w:r>
+        <w:r>
+          <w:t>הרָכְּזְאֶ</w:t>
+        </w:r>
+        <w:r>
+          <w:t xml:space="preserve"> </w:t>
+        </w:r>
+        <w:r>
+          <w:t>הלֶּאֵ</w:t>
+        </w:r>
+        <w:r>
+          <w:t>‬</w:t>
+        </w:r>
+        <w:r>
+          <w:t>, 'These things I remember, and I pour out my soul upon myself.' The liturgists heard in Psalm 42 not a resolved confession of faith but a template for remembering catastrophe while continuing to pray. That is the psalm's lasting discipline: not the assurance that the water will come, but the refusal t</w:t>
+        </w:r>
+        <w:r>
+          <w:t>o stop crying for it.‏</w:t>
+        </w:r>
+      </w:bdo>
     </w:p>
     <w:p>
       <w:pPr>
-        <w:pStyle w:val="BodySans"/>
-      </w:pPr>
-      <w:r>
-        <w:t xml:space="preserve">Psalm 42 is recited in its entirety in two settings within the Mizrachi/Sephardic (Edot HaMizrach) tradition. During Sukkot, it appears within the Mussaf service — a placement that makes its water imagery vibrate against the festival's ancient water-libation rites (the </w:t>
-      </w:r>
-      <w:r>
-        <w:rPr>
-          <w:i/>
-        </w:rPr>
-        <w:t>Simchat Beit HaShoevah</w:t>
-      </w:r>
-      <w:r>
-        <w:t>, when priests drew water from the Shiloah spring to pour on the altar). The deer's thirst for watercourses, heard alongside the festival's ritual pouring, transforms personal longing into a liturgical emblem of Israel's dependence on divine sustenance.</w:t>
+        <w:pStyle w:val="Heading2"/>
+      </w:pPr>
+      <w:r>
+        <w:t>Modern Jewish Liturgical Use</w:t>
       </w:r>
     </w:p>
     <w:p>
       <w:pPr>
-        <w:pStyle w:val="BodySans"/>
-      </w:pPr>
-      <w:r>
-        <w:t xml:space="preserve">More regularly, the full psalm appears in the nocturnal </w:t>
-      </w:r>
-      <w:r>
-        <w:rPr>
-          <w:i/>
-        </w:rPr>
-        <w:t>Tikkun Chatzot</w:t>
-      </w:r>
-      <w:r>
-        <w:t xml:space="preserve"> — the midnight rite mourning the Temple's destruction — specifically within the section known as </w:t>
-      </w:r>
-      <w:r>
-        <w:rPr>
-          <w:i/>
-        </w:rPr>
-        <w:t>Tikkun Leah</w:t>
-      </w:r>
-      <w:r>
-        <w:t xml:space="preserve">. There it joins Psalm 43 and other texts, and the language of exile from God's presence is heard as Israel's collective voice of mourning and eschatological hope. The midnight setting literalizes what the psalm declares: that tears are bread </w:t>
-      </w:r>
-      <w:r>
-        <w:t>יוֹמָם</w:t>
-      </w:r>
-      <w:r>
-        <w:t xml:space="preserve"> </w:t>
-      </w:r>
-      <w:r>
-        <w:t>וָלָיְלָה</w:t>
-      </w:r>
-      <w:r>
-        <w:t>,‎ 'day and night' (v.4).‏</w:t>
+        <w:pStyle w:val="Heading4"/>
+      </w:pPr>
+      <w:r>
+        <w:t>Full Psalm Recitation</w:t>
       </w:r>
     </w:p>
     <w:p>
       <w:pPr>
+        <w:pStyle w:val="BodySans"/>
+      </w:pPr>
+      <w:r>
+        <w:t xml:space="preserve">Psalm 42 is recited in its entirety in two settings within the Mizrachi/Sephardic (Edot HaMizrach) tradition. During Sukkot, it appears within the Mussaf service — a placement that makes its water imagery vibrate against the festival's ancient water-libation rites (the </w:t>
+      </w:r>
+      <w:r>
+        <w:rPr>
+          <w:i/>
+        </w:rPr>
+        <w:t>Simchat Beit HaShoevah</w:t>
+      </w:r>
+      <w:r>
+        <w:t>, when priests drew water from the Shiloah spring to pour on the altar). The deer's thirst for watercourses, heard alongside the festival's ritual pouring, transforms personal longing into a liturgical emblem of Israel's dependence on divine sustenance.</w:t>
+      </w:r>
+    </w:p>
+    <w:p>
+      <w:pPr>
+        <w:pStyle w:val="BodySans"/>
+      </w:pPr>
+      <w:r>
+        <w:t xml:space="preserve">More regularly, the full psalm appears in the nocturnal </w:t>
+      </w:r>
+      <w:r>
+        <w:rPr>
+          <w:i/>
+        </w:rPr>
+        <w:t>Tikkun Chatzot</w:t>
+      </w:r>
+      <w:r>
+        <w:t xml:space="preserve"> — the midnight rite mourning the Temple's destruction — specifically within the section known as </w:t>
+      </w:r>
+      <w:r>
+        <w:rPr>
+          <w:i/>
+        </w:rPr>
+        <w:t>Tikkun Leah</w:t>
+      </w:r>
+      <w:r>
+        <w:t xml:space="preserve">. There it joins Psalm 43 and other texts, and the language of exile from God's presence is heard as Israel's collective voice of mourning and eschatological hope. The midnight setting literalizes what the psalm declares: that tears are bread </w:t>
+      </w:r>
+      <w:r>
+        <w:t>יוֹמָם</w:t>
+      </w:r>
+      <w:r>
+        <w:t xml:space="preserve"> </w:t>
+      </w:r>
+      <w:r>
+        <w:t>וָלָיְלָה</w:t>
+      </w:r>
+      <w:r>
+        <w:t>,‎ 'day and night' (v.4).‏</w:t>
+      </w:r>
+    </w:p>
+    <w:p>
+      <w:pPr>
         <w:pStyle w:val="Heading4"/>
       </w:pPr>
       <w:r>
@@ -1457,219 +1575,119 @@
         <w:t>Verse 9</w:t>
       </w:r>
       <w:r>
-        <w:t xml:space="preserve"> is the most liturgically mobile verse in the psalm. In the Edot HaMizrach evening service for Shabbat and the High Holidays, </w:t>
-      </w:r>
-      <w:r>
-        <w:t>יוֹמָם</w:t>
-      </w:r>
-      <w:r>
-        <w:t xml:space="preserve"> </w:t>
-      </w:r>
-      <w:r>
-        <w:t>יְצַוֶּה</w:t>
-      </w:r>
-      <w:r>
-        <w:t xml:space="preserve"> </w:t>
-      </w:r>
-      <w:r>
-        <w:t>ה׳</w:t>
-      </w:r>
-      <w:r>
-        <w:t xml:space="preserve"> </w:t>
-      </w:r>
-      <w:r>
-        <w:t>חַסְדּוֹ</w:t>
-      </w:r>
-      <w:r>
-        <w:t xml:space="preserve"> </w:t>
-      </w:r>
-      <w:r>
-        <w:t>וּבַלַּיְלָה</w:t>
-      </w:r>
-      <w:r>
-        <w:t xml:space="preserve"> </w:t>
-      </w:r>
-      <w:r>
-        <w:t>שִׁירֹה</w:t>
-      </w:r>
-      <w:r>
-        <w:t xml:space="preserve"> </w:t>
-      </w:r>
-      <w:r>
-        <w:t>עִמִּי</w:t>
-      </w:r>
-      <w:r>
-        <w:t xml:space="preserve">,‎ 'By day may YHWH command His faithful care, and at night His song may be with me,' appears in a chain of verses preceding the </w:t>
-      </w:r>
-      <w:r>
-        <w:rPr>
-          <w:i/>
-        </w:rPr>
-        <w:t>Barekhu</w:t>
-      </w:r>
-      <w:r>
-        <w:t xml:space="preserve"> (call to communal prayer), linking it with </w:t>
-      </w:r>
-      <w:r>
-        <w:t>כֹּל</w:t>
-      </w:r>
-      <w:r>
-        <w:t xml:space="preserve"> </w:t>
-      </w:r>
-      <w:r>
-        <w:t>הַנְּשָׁמָה</w:t>
-      </w:r>
-      <w:r>
-        <w:t xml:space="preserve"> </w:t>
-      </w:r>
-      <w:r>
-        <w:t>תְּהַלֵּל</w:t>
-      </w:r>
-      <w:r>
-        <w:t xml:space="preserve"> </w:t>
-      </w:r>
-      <w:r>
-        <w:t>יָהּ</w:t>
-      </w:r>
-      <w:r>
-        <w:t>,‎ 'Let all that breathes praise Yah' (Ps 150:6), as a scriptural threshold between private preparation and public worsh</w:t>
-      </w:r>
-      <w:r>
-        <w:t xml:space="preserve">ip. The same verse surfaces again in the Yom Kippur Selichot and in the Yom Kippur Katan rite (the monthly penitential service on the eve of the new month), where the phrase </w:t>
-      </w:r>
-      <w:r>
-        <w:t>יְצַוֶּה</w:t>
-      </w:r>
-      <w:r>
-        <w:t xml:space="preserve"> </w:t>
-      </w:r>
-      <w:r>
-        <w:t>ה׳</w:t>
-      </w:r>
-      <w:r>
-        <w:t xml:space="preserve"> </w:t>
-      </w:r>
-      <w:r>
-        <w:t>חַסְדּוֹ</w:t>
-      </w:r>
-      <w:r>
-        <w:t>,‎ 'May YHWH command His faithful care,' is explicitly tied to petitions for the Temple's restoration — the very thing the psalmist longs for.‏</w:t>
+        <w:t xml:space="preserve"> is the most liturgically mobile verse in the psalm. In the Edot HaMizrach evening service for Shabbat and the High Holidays,</w:t>
       </w:r>
     </w:p>
     <w:p>
       <w:pPr>
         <w:pStyle w:val="BodySans"/>
-      </w:pPr>
-      <w:r>
-        <w:rPr>
-          <w:b/>
-        </w:rPr>
-        <w:t>Verse 2's</w:t>
-      </w:r>
-      <w:r>
-        <w:t xml:space="preserve"> imagery of the thirsting deer enters the Shabbat table through the Friday evening </w:t>
-      </w:r>
-      <w:r>
-        <w:rPr>
-          <w:i/>
-        </w:rPr>
-        <w:t>zemer</w:t>
-      </w:r>
-      <w:r>
-        <w:t xml:space="preserve"> (hymn) </w:t>
-      </w:r>
-      <w:r>
-        <w:rPr>
-          <w:i/>
-        </w:rPr>
-        <w:t>Mah Yedidut</w:t>
-      </w:r>
-      <w:r>
-        <w:t xml:space="preserve">, sung across Ashkenazic, Hasidic, and Mizrachi traditions: </w:t>
-      </w:r>
-      <w:r>
-        <w:t>בְּכֵן</w:t>
-      </w:r>
-      <w:r>
+        <w:bidi/>
+        <w:ind w:left="432" w:right="432"/>
+        <w:jc w:val="right"/>
+      </w:pPr>
+      <w:r>
+        <w:rPr>
+          <w:rFonts w:ascii="Times New Roman" w:hAnsi="Times New Roman"/>
+          <w:sz w:val="26"/>
+          <w:szCs w:val="26"/>
+        </w:rPr>
+        <w:t>יוֹמָם</w:t>
+      </w:r>
+      <w:r>
+        <w:rPr>
+          <w:rFonts w:ascii="Times New Roman" w:hAnsi="Times New Roman"/>
+          <w:sz w:val="26"/>
+          <w:szCs w:val="26"/>
+        </w:rPr>
         <w:t xml:space="preserve"> </w:t>
       </w:r>
       <w:r>
-        <w:t>נַפְשִׁי</w:t>
-      </w:r>
-      <w:r>
+        <w:rPr>
+          <w:rFonts w:ascii="Times New Roman" w:hAnsi="Times New Roman"/>
+          <w:sz w:val="26"/>
+          <w:szCs w:val="26"/>
+        </w:rPr>
+        <w:t>יְצַוֶּה</w:t>
+      </w:r>
+      <w:r>
+        <w:rPr>
+          <w:rFonts w:ascii="Times New Roman" w:hAnsi="Times New Roman"/>
+          <w:sz w:val="26"/>
+          <w:szCs w:val="26"/>
+        </w:rPr>
         <w:t xml:space="preserve"> </w:t>
       </w:r>
       <w:r>
-        <w:t>לְךָ</w:t>
-      </w:r>
-      <w:r>
+        <w:rPr>
+          <w:rFonts w:ascii="Times New Roman" w:hAnsi="Times New Roman"/>
+          <w:sz w:val="26"/>
+          <w:szCs w:val="26"/>
+        </w:rPr>
+        <w:t>ה׳</w:t>
+      </w:r>
+      <w:r>
+        <w:rPr>
+          <w:rFonts w:ascii="Times New Roman" w:hAnsi="Times New Roman"/>
+          <w:sz w:val="26"/>
+          <w:szCs w:val="26"/>
+        </w:rPr>
         <w:t xml:space="preserve"> </w:t>
       </w:r>
       <w:r>
-        <w:t>עָרְגָה</w:t>
-      </w:r>
-      <w:r>
-        <w:t xml:space="preserve">,‎ 'so does my soul yearn for You,' adapting the psalmist's cry into serene Sabbath longing. In the Hasidic rite (Nusach Sefard), the full simile </w:t>
-      </w:r>
-      <w:r>
-        <w:t>כְּאַיָּל</w:t>
-      </w:r>
-      <w:r>
+        <w:rPr>
+          <w:rFonts w:ascii="Times New Roman" w:hAnsi="Times New Roman"/>
+          <w:sz w:val="26"/>
+          <w:szCs w:val="26"/>
+        </w:rPr>
+        <w:t>חַסְדּוֹ</w:t>
+      </w:r>
+      <w:r>
+        <w:rPr>
+          <w:rFonts w:ascii="Times New Roman" w:hAnsi="Times New Roman"/>
+          <w:sz w:val="26"/>
+          <w:szCs w:val="26"/>
+        </w:rPr>
         <w:t xml:space="preserve"> </w:t>
       </w:r>
       <w:r>
-        <w:t>תַּעֲרֹג</w:t>
-      </w:r>
-      <w:r>
+        <w:rPr>
+          <w:rFonts w:ascii="Times New Roman" w:hAnsi="Times New Roman"/>
+          <w:sz w:val="26"/>
+          <w:szCs w:val="26"/>
+        </w:rPr>
+        <w:t>וּבַלַּיְלָה</w:t>
+      </w:r>
+      <w:r>
+        <w:rPr>
+          <w:rFonts w:ascii="Times New Roman" w:hAnsi="Times New Roman"/>
+          <w:sz w:val="26"/>
+          <w:szCs w:val="26"/>
+        </w:rPr>
         <w:t xml:space="preserve"> </w:t>
       </w:r>
       <w:r>
-        <w:t>עַל</w:t>
-      </w:r>
-      <w:r>
+        <w:rPr>
+          <w:rFonts w:ascii="Times New Roman" w:hAnsi="Times New Roman"/>
+          <w:sz w:val="26"/>
+          <w:szCs w:val="26"/>
+        </w:rPr>
+        <w:t>שִׁירֹה</w:t>
+      </w:r>
+      <w:r>
+        <w:rPr>
+          <w:rFonts w:ascii="Times New Roman" w:hAnsi="Times New Roman"/>
+          <w:sz w:val="26"/>
+          <w:szCs w:val="26"/>
+        </w:rPr>
         <w:t xml:space="preserve"> </w:t>
       </w:r>
       <w:r>
-        <w:t>אֲפִיקֵי</w:t>
-      </w:r>
-      <w:r>
-        <w:t xml:space="preserve"> </w:t>
-      </w:r>
-      <w:r>
-        <w:t>מַיִם</w:t>
-      </w:r>
-      <w:r>
-        <w:t xml:space="preserve"> </w:t>
-      </w:r>
-      <w:r>
-        <w:t>כֵּן</w:t>
-      </w:r>
-      <w:r>
-        <w:t xml:space="preserve"> </w:t>
-      </w:r>
-      <w:r>
-        <w:t>נַפְשָׁם</w:t>
-      </w:r>
-      <w:r>
-        <w:t xml:space="preserve"> </w:t>
-      </w:r>
-      <w:r>
-        <w:t>תַּעֲרֹג</w:t>
-      </w:r>
-      <w:r>
-        <w:t xml:space="preserve">,‎ 'As a deer cries for watercourses, so do their souls cry,' is woven into </w:t>
-      </w:r>
-      <w:r>
-        <w:rPr>
-          <w:i/>
-        </w:rPr>
-        <w:t>zemirot</w:t>
-      </w:r>
-      <w:r>
-        <w:t xml:space="preserve"> for Friday night, transposi</w:t>
-      </w:r>
-      <w:r>
-        <w:t>ng the psalm's anguish into the anticipatory joy of receiving Shabbat.</w:t>
+        <w:rPr>
+          <w:rFonts w:ascii="Times New Roman" w:hAnsi="Times New Roman"/>
+          <w:sz w:val="26"/>
+          <w:szCs w:val="26"/>
+        </w:rPr>
+        <w:t>עִמִּי</w:t>
       </w:r>
     </w:p>
     <w:p>
@@ -1677,104 +1695,72 @@
         <w:pStyle w:val="BodySans"/>
       </w:pPr>
       <w:r>
-        <w:rPr>
-          <w:b/>
-        </w:rPr>
-        <w:t>Verse 3's</w:t>
-      </w:r>
-      <w:r>
-        <w:t xml:space="preserve"> </w:t>
-      </w:r>
-      <w:r>
-        <w:t>צָמְאָה</w:t>
-      </w:r>
-      <w:r>
-        <w:t xml:space="preserve"> </w:t>
-      </w:r>
-      <w:r>
-        <w:t>נַפְשִׁי</w:t>
-      </w:r>
-      <w:r>
-        <w:t xml:space="preserve"> </w:t>
-      </w:r>
-      <w:r>
-        <w:t>לֵאלֹקִים</w:t>
-      </w:r>
-      <w:r>
-        <w:t xml:space="preserve"> </w:t>
-      </w:r>
-      <w:r>
-        <w:t>לְאֵל</w:t>
-      </w:r>
-      <w:r>
-        <w:t xml:space="preserve"> </w:t>
-      </w:r>
-      <w:r>
-        <w:t>חָי</w:t>
-      </w:r>
-      <w:r>
-        <w:t xml:space="preserve">,‎ 'My soul thirsts for God, the living God,' opens the piyyut </w:t>
+        <w:t xml:space="preserve">'By day may YHWH command His faithful care, and at night His song may be with me,' appears in a chain of verses preceding the </w:t>
       </w:r>
       <w:r>
         <w:rPr>
           <w:i/>
         </w:rPr>
-        <w:t>Tzamah Nafshi</w:t>
-      </w:r>
-      <w:r>
-        <w:t xml:space="preserve">, which serves in the classical Ashkenaz rite as a </w:t>
-      </w:r>
-      <w:r>
-        <w:rPr>
-          <w:i/>
-        </w:rPr>
-        <w:t>reshut</w:t>
-      </w:r>
-      <w:r>
-        <w:t xml:space="preserve"> (poetic prelude) before the first blessing of the Shema at Shabbat </w:t>
-      </w:r>
-      <w:r>
-        <w:rPr>
-          <w:i/>
-        </w:rPr>
-        <w:t>Ma'ariv</w:t>
-      </w:r>
-      <w:r>
-        <w:t xml:space="preserve">. In the Hasidic rite, it appears among the Shabbat daytime </w:t>
-      </w:r>
-      <w:r>
-        <w:rPr>
-          <w:i/>
-        </w:rPr>
-        <w:t>Kiddush</w:t>
-      </w:r>
-      <w:r>
-        <w:t xml:space="preserve"> poems, where the phrase is adapted to </w:t>
-      </w:r>
-      <w:r>
-        <w:t>צָמְאָה</w:t>
-      </w:r>
-      <w:r>
-        <w:t xml:space="preserve"> </w:t>
-      </w:r>
-      <w:r>
-        <w:t>נַפְשִׁי</w:t>
-      </w:r>
-      <w:r>
-        <w:t xml:space="preserve"> </w:t>
-      </w:r>
-      <w:r>
-        <w:t>אֶל</w:t>
-      </w:r>
-      <w:r>
-        <w:t xml:space="preserve"> </w:t>
-      </w:r>
-      <w:r>
-        <w:t>ה׳</w:t>
-      </w:r>
-      <w:r>
-        <w:t>,‎ 'My soul thirsts for YHWH,' directing the psalmist's thirst explicitly toward the covenant name.‏</w:t>
-      </w:r>
+        <w:t>Barekhu</w:t>
+      </w:r>
+      <w:r>
+        <w:t xml:space="preserve"> (call to communal prayer), linking it with </w:t>
+      </w:r>
+      <w:bdo w:val="ltr">
+        <w:r>
+          <w:t>הּיָ</w:t>
+        </w:r>
+        <w:r>
+          <w:t xml:space="preserve"> </w:t>
+        </w:r>
+        <w:r>
+          <w:t>ללֵּהַתְּ</w:t>
+        </w:r>
+        <w:r>
+          <w:t xml:space="preserve"> </w:t>
+        </w:r>
+        <w:r>
+          <w:t>המָשָׁנְּהַ</w:t>
+        </w:r>
+        <w:r>
+          <w:t xml:space="preserve"> </w:t>
+        </w:r>
+        <w:r>
+          <w:t>לכֹּ</w:t>
+        </w:r>
+        <w:r>
+          <w:t>‬</w:t>
+        </w:r>
+        <w:r>
+          <w:t xml:space="preserve">, 'Let all that breathes praise Yah' (Ps 150:6), as a scriptural threshold between private preparation and public worship. The same verse surfaces again in the Yom Kippur Selichot and in the Yom Kippur Katan rite (the monthly penitential service on the eve of the new month), where the phrase </w:t>
+        </w:r>
+        <w:bdo w:val="ltr">
+          <w:r>
+            <w:t>וֹדּסְחַ</w:t>
+          </w:r>
+          <w:r>
+            <w:t xml:space="preserve"> </w:t>
+          </w:r>
+          <w:r>
+            <w:t>׳ה</w:t>
+          </w:r>
+          <w:r>
+            <w:t xml:space="preserve"> </w:t>
+          </w:r>
+          <w:r>
+            <w:t>הוֶּצַיְ</w:t>
+          </w:r>
+          <w:r>
+            <w:t>‬</w:t>
+          </w:r>
+          <w:r>
+            <w:t>, 'May YHWH command His faithful care,' is explicitly tied to petitions for the Temple's restoration — the very t</w:t>
+          </w:r>
+          <w:r>
+            <w:t>hing the psalmist longs for.‏</w:t>
+          </w:r>
+        </w:bdo>
+      </w:bdo>
     </w:p>
     <w:p>
       <w:pPr>
@@ -1784,6 +1770,326 @@
         <w:rPr>
           <w:b/>
         </w:rPr>
+        <w:t>Verse 2's</w:t>
+      </w:r>
+      <w:r>
+        <w:t xml:space="preserve"> imagery of the thirsting deer enters the Shabbat table through the Friday evening </w:t>
+      </w:r>
+      <w:r>
+        <w:rPr>
+          <w:i/>
+        </w:rPr>
+        <w:t>zemer</w:t>
+      </w:r>
+      <w:r>
+        <w:t xml:space="preserve"> (hymn) </w:t>
+      </w:r>
+      <w:r>
+        <w:rPr>
+          <w:i/>
+        </w:rPr>
+        <w:t>Mah Yedidut</w:t>
+      </w:r>
+      <w:r>
+        <w:t xml:space="preserve">, sung across Ashkenazic, Hasidic, and Mizrachi traditions: </w:t>
+      </w:r>
+      <w:bdo w:val="ltr">
+        <w:r>
+          <w:t>הגָרְעָ</w:t>
+        </w:r>
+        <w:r>
+          <w:t xml:space="preserve"> </w:t>
+        </w:r>
+        <w:r>
+          <w:t>ךָלְ</w:t>
+        </w:r>
+        <w:r>
+          <w:t xml:space="preserve"> </w:t>
+        </w:r>
+        <w:r>
+          <w:t>ישִׁפְנַ</w:t>
+        </w:r>
+        <w:r>
+          <w:t xml:space="preserve"> </w:t>
+        </w:r>
+        <w:r>
+          <w:t>ןכֵבְּ</w:t>
+        </w:r>
+        <w:r>
+          <w:t>‬</w:t>
+        </w:r>
+        <w:r>
+          <w:t>, 'so does my soul yearn for You,' adapting the psalmist's cry into serene Sabbath longing. In the Hasidic rite (Nusach Sefard), the full simile</w:t>
+        </w:r>
+      </w:bdo>
+    </w:p>
+    <w:p>
+      <w:pPr>
+        <w:pStyle w:val="BodySans"/>
+        <w:bidi/>
+        <w:ind w:left="432" w:right="432"/>
+        <w:jc w:val="right"/>
+      </w:pPr>
+      <w:r>
+        <w:rPr>
+          <w:rFonts w:ascii="Times New Roman" w:hAnsi="Times New Roman"/>
+          <w:sz w:val="26"/>
+          <w:szCs w:val="26"/>
+        </w:rPr>
+        <w:t>כְּאַיָּל</w:t>
+      </w:r>
+      <w:r>
+        <w:rPr>
+          <w:rFonts w:ascii="Times New Roman" w:hAnsi="Times New Roman"/>
+          <w:sz w:val="26"/>
+          <w:szCs w:val="26"/>
+        </w:rPr>
+        <w:t xml:space="preserve"> </w:t>
+      </w:r>
+      <w:r>
+        <w:rPr>
+          <w:rFonts w:ascii="Times New Roman" w:hAnsi="Times New Roman"/>
+          <w:sz w:val="26"/>
+          <w:szCs w:val="26"/>
+        </w:rPr>
+        <w:t>תַּעֲרֹג</w:t>
+      </w:r>
+      <w:r>
+        <w:rPr>
+          <w:rFonts w:ascii="Times New Roman" w:hAnsi="Times New Roman"/>
+          <w:sz w:val="26"/>
+          <w:szCs w:val="26"/>
+        </w:rPr>
+        <w:t xml:space="preserve"> </w:t>
+      </w:r>
+      <w:r>
+        <w:rPr>
+          <w:rFonts w:ascii="Times New Roman" w:hAnsi="Times New Roman"/>
+          <w:sz w:val="26"/>
+          <w:szCs w:val="26"/>
+        </w:rPr>
+        <w:t>עַל</w:t>
+      </w:r>
+      <w:r>
+        <w:rPr>
+          <w:rFonts w:ascii="Times New Roman" w:hAnsi="Times New Roman"/>
+          <w:sz w:val="26"/>
+          <w:szCs w:val="26"/>
+        </w:rPr>
+        <w:t xml:space="preserve"> </w:t>
+      </w:r>
+      <w:r>
+        <w:rPr>
+          <w:rFonts w:ascii="Times New Roman" w:hAnsi="Times New Roman"/>
+          <w:sz w:val="26"/>
+          <w:szCs w:val="26"/>
+        </w:rPr>
+        <w:t>אֲפִיקֵי</w:t>
+      </w:r>
+      <w:r>
+        <w:rPr>
+          <w:rFonts w:ascii="Times New Roman" w:hAnsi="Times New Roman"/>
+          <w:sz w:val="26"/>
+          <w:szCs w:val="26"/>
+        </w:rPr>
+        <w:t xml:space="preserve"> </w:t>
+      </w:r>
+      <w:r>
+        <w:rPr>
+          <w:rFonts w:ascii="Times New Roman" w:hAnsi="Times New Roman"/>
+          <w:sz w:val="26"/>
+          <w:szCs w:val="26"/>
+        </w:rPr>
+        <w:t>מַיִם</w:t>
+      </w:r>
+      <w:r>
+        <w:rPr>
+          <w:rFonts w:ascii="Times New Roman" w:hAnsi="Times New Roman"/>
+          <w:sz w:val="26"/>
+          <w:szCs w:val="26"/>
+        </w:rPr>
+        <w:t xml:space="preserve"> </w:t>
+      </w:r>
+      <w:r>
+        <w:rPr>
+          <w:rFonts w:ascii="Times New Roman" w:hAnsi="Times New Roman"/>
+          <w:sz w:val="26"/>
+          <w:szCs w:val="26"/>
+        </w:rPr>
+        <w:t>כֵּן</w:t>
+      </w:r>
+      <w:r>
+        <w:rPr>
+          <w:rFonts w:ascii="Times New Roman" w:hAnsi="Times New Roman"/>
+          <w:sz w:val="26"/>
+          <w:szCs w:val="26"/>
+        </w:rPr>
+        <w:t xml:space="preserve"> </w:t>
+      </w:r>
+      <w:r>
+        <w:rPr>
+          <w:rFonts w:ascii="Times New Roman" w:hAnsi="Times New Roman"/>
+          <w:sz w:val="26"/>
+          <w:szCs w:val="26"/>
+        </w:rPr>
+        <w:t>נַפְשָׁם</w:t>
+      </w:r>
+      <w:r>
+        <w:rPr>
+          <w:rFonts w:ascii="Times New Roman" w:hAnsi="Times New Roman"/>
+          <w:sz w:val="26"/>
+          <w:szCs w:val="26"/>
+        </w:rPr>
+        <w:t xml:space="preserve"> </w:t>
+      </w:r>
+      <w:r>
+        <w:rPr>
+          <w:rFonts w:ascii="Times New Roman" w:hAnsi="Times New Roman"/>
+          <w:sz w:val="26"/>
+          <w:szCs w:val="26"/>
+        </w:rPr>
+        <w:t>תַּעֲרֹג</w:t>
+      </w:r>
+    </w:p>
+    <w:p>
+      <w:pPr>
+        <w:pStyle w:val="BodySans"/>
+      </w:pPr>
+      <w:r>
+        <w:t xml:space="preserve">'As a deer cries for watercourses, so do their souls cry,' is woven into </w:t>
+      </w:r>
+      <w:r>
+        <w:rPr>
+          <w:i/>
+        </w:rPr>
+        <w:t>zemirot</w:t>
+      </w:r>
+      <w:r>
+        <w:t xml:space="preserve"> for Friday night, transposing the psalm's anguish into the anticipatory joy of receiving Shabbat.</w:t>
+      </w:r>
+    </w:p>
+    <w:p>
+      <w:pPr>
+        <w:pStyle w:val="BodySans"/>
+      </w:pPr>
+      <w:r>
+        <w:rPr>
+          <w:b/>
+        </w:rPr>
+        <w:t>Verse 3's</w:t>
+      </w:r>
+      <w:r>
+        <w:t xml:space="preserve"> </w:t>
+      </w:r>
+      <w:bdo w:val="ltr">
+        <w:r>
+          <w:t>יחָ</w:t>
+        </w:r>
+        <w:r>
+          <w:t xml:space="preserve"> </w:t>
+        </w:r>
+        <w:r>
+          <w:t>לאֵלְ</w:t>
+        </w:r>
+        <w:r>
+          <w:t xml:space="preserve"> </w:t>
+        </w:r>
+        <w:r>
+          <w:t>םיקִלֹאלֵ</w:t>
+        </w:r>
+        <w:r>
+          <w:t xml:space="preserve"> </w:t>
+        </w:r>
+        <w:r>
+          <w:t>ישִׁפְנַ</w:t>
+        </w:r>
+        <w:r>
+          <w:t xml:space="preserve"> </w:t>
+        </w:r>
+        <w:r>
+          <w:t>האָמְצָ</w:t>
+        </w:r>
+        <w:r>
+          <w:t>‬</w:t>
+        </w:r>
+        <w:r>
+          <w:t xml:space="preserve">, 'My soul thirsts for God, the living God,' opens the piyyut </w:t>
+        </w:r>
+        <w:r>
+          <w:rPr>
+            <w:i/>
+          </w:rPr>
+          <w:t>Tzamah Nafshi</w:t>
+        </w:r>
+        <w:r>
+          <w:t xml:space="preserve">, which serves in the classical Ashkenaz rite as a </w:t>
+        </w:r>
+        <w:r>
+          <w:rPr>
+            <w:i/>
+          </w:rPr>
+          <w:t>reshut</w:t>
+        </w:r>
+        <w:r>
+          <w:t xml:space="preserve"> (poetic prelude) before the first blessing of the Shema at Shabbat </w:t>
+        </w:r>
+        <w:r>
+          <w:rPr>
+            <w:i/>
+          </w:rPr>
+          <w:t>Ma'ariv</w:t>
+        </w:r>
+        <w:r>
+          <w:t xml:space="preserve">. In the Hasidic rite, it appears among the Shabbat daytime </w:t>
+        </w:r>
+        <w:r>
+          <w:rPr>
+            <w:i/>
+          </w:rPr>
+          <w:t>Kiddush</w:t>
+        </w:r>
+        <w:r>
+          <w:t xml:space="preserve"> poems, where the phrase is adapted to </w:t>
+        </w:r>
+        <w:bdo w:val="ltr">
+          <w:r>
+            <w:t>׳ה</w:t>
+          </w:r>
+          <w:r>
+            <w:t xml:space="preserve"> </w:t>
+          </w:r>
+          <w:r>
+            <w:t>לאֶ</w:t>
+          </w:r>
+          <w:r>
+            <w:t xml:space="preserve"> </w:t>
+          </w:r>
+          <w:r>
+            <w:t>ישִׁפְנַ</w:t>
+          </w:r>
+          <w:r>
+            <w:t xml:space="preserve"> </w:t>
+          </w:r>
+          <w:r>
+            <w:t>האָמְצָ</w:t>
+          </w:r>
+          <w:r>
+            <w:t>‬</w:t>
+          </w:r>
+          <w:r>
+            <w:t>, 'My soul thirsts for YHWH,' directing the psalmist's thirst explicitly toward the covenant name.‏</w:t>
+          </w:r>
+        </w:bdo>
+      </w:bdo>
+    </w:p>
+    <w:p>
+      <w:pPr>
+        <w:pStyle w:val="BodySans"/>
+      </w:pPr>
+      <w:r>
+        <w:rPr>
+          <w:b/>
+        </w:rPr>
         <w:t>Verse 5's</w:t>
       </w:r>
       <w:r>
@@ -1810,36 +2116,41 @@
       <w:r>
         <w:t xml:space="preserve"> section that recounts the deaths of ten rabbinic sages under Rome: </w:t>
       </w:r>
-      <w:r>
-        <w:t>אֵלֶּה</w:t>
-      </w:r>
-      <w:r>
-        <w:t xml:space="preserve"> </w:t>
-      </w:r>
-      <w:r>
-        <w:t>אֶזְכְּרָה</w:t>
-      </w:r>
-      <w:r>
-        <w:t xml:space="preserve"> </w:t>
-      </w:r>
-      <w:r>
-        <w:t>וְנַפְשִׁי</w:t>
-      </w:r>
-      <w:r>
-        <w:t xml:space="preserve"> </w:t>
-      </w:r>
-      <w:r>
-        <w:t>עָלַי</w:t>
-      </w:r>
-      <w:r>
-        <w:t xml:space="preserve"> </w:t>
-      </w:r>
-      <w:r>
-        <w:t>אֶשְׁפְּכָה</w:t>
-      </w:r>
-      <w:r>
-        <w:t>,‎ 'These things I remember and I pour out my soul upon myself.' The liturgists thus convert the psalmist's individual grief at lost pilgrimage into a communal instrument for processing national catastrophe — arguably the boldest recontextualization of any phrase in the psalm.‏</w:t>
-      </w:r>
+      <w:bdo w:val="ltr">
+        <w:r>
+          <w:t>הכָפְּשְׁאֶ</w:t>
+        </w:r>
+        <w:r>
+          <w:t xml:space="preserve"> </w:t>
+        </w:r>
+        <w:r>
+          <w:t>ילַעָ</w:t>
+        </w:r>
+        <w:r>
+          <w:t xml:space="preserve"> </w:t>
+        </w:r>
+        <w:r>
+          <w:t>ישִׁפְנַוְ</w:t>
+        </w:r>
+        <w:r>
+          <w:t xml:space="preserve"> </w:t>
+        </w:r>
+        <w:r>
+          <w:t>הרָכְּזְאֶ</w:t>
+        </w:r>
+        <w:r>
+          <w:t xml:space="preserve"> </w:t>
+        </w:r>
+        <w:r>
+          <w:t>הלֶּאֵ</w:t>
+        </w:r>
+        <w:r>
+          <w:t>‬</w:t>
+        </w:r>
+        <w:r>
+          <w:t>, 'These things I remember and I pour out my soul upon myself.' The liturgists thus convert the psalmist's individual grief at lost pilgrimage into a communal instrument for processing national catastrophe — arguably the boldest recontextualization of any phrase in the psalm.‏</w:t>
+        </w:r>
+      </w:bdo>
     </w:p>
     <w:p>
       <w:pPr>
@@ -2526,72 +2837,119 @@
         <w:t>תאכל</w:t>
       </w:r>
       <w:r>
-        <w:t xml:space="preserve">,‎ 'wept and did not eat' (1 Sam 1:7). The parallel in Psalm 102:10 is even closer: </w:t>
-      </w:r>
-      <w:r>
-        <w:t>כִּי</w:t>
-      </w:r>
-      <w:r>
-        <w:t xml:space="preserve"> </w:t>
-      </w:r>
-      <w:r>
-        <w:t>אֵפֶר</w:t>
-      </w:r>
-      <w:r>
-        <w:t xml:space="preserve"> </w:t>
-      </w:r>
-      <w:r>
-        <w:t>כַּלֶּחֶם</w:t>
-      </w:r>
-      <w:r>
-        <w:t xml:space="preserve"> </w:t>
-      </w:r>
-      <w:r>
-        <w:t>אָכָלְתִּי</w:t>
-      </w:r>
-      <w:r>
-        <w:t xml:space="preserve"> </w:t>
-      </w:r>
-      <w:r>
-        <w:t>וְשִׁקֻּוַי</w:t>
-      </w:r>
-      <w:r>
-        <w:t xml:space="preserve"> </w:t>
-      </w:r>
-      <w:r>
-        <w:t>בִּבְכִי</w:t>
-      </w:r>
-      <w:r>
-        <w:t xml:space="preserve"> </w:t>
-      </w:r>
-      <w:r>
-        <w:t>מָסָכְתִּי</w:t>
-      </w:r>
-      <w:r>
-        <w:t>,‎ 'For I have eaten ashes li</w:t>
-      </w:r>
-      <w:r>
-        <w:t>ke bread and mixed my drink with tears' — ashes for food, tears for drink, the entire alimentary system colonized by grief.‏</w:t>
+        <w:t>,‎ 'wept and did not eat' (1 Sam 1:7). The parallel in Psalm 102:10 is even closer:‏</w:t>
       </w:r>
     </w:p>
     <w:p>
       <w:pPr>
         <w:pStyle w:val="BodySans"/>
-      </w:pPr>
-      <w:r>
-        <w:t xml:space="preserve">The temporal marker </w:t>
-      </w:r>
-      <w:r>
-        <w:t>יוֹמָם</w:t>
-      </w:r>
-      <w:r>
+        <w:bidi/>
+        <w:ind w:left="432" w:right="432"/>
+        <w:jc w:val="right"/>
+      </w:pPr>
+      <w:r>
+        <w:rPr>
+          <w:rFonts w:ascii="Times New Roman" w:hAnsi="Times New Roman"/>
+          <w:sz w:val="26"/>
+          <w:szCs w:val="26"/>
+        </w:rPr>
+        <w:t>כִּי</w:t>
+      </w:r>
+      <w:r>
+        <w:rPr>
+          <w:rFonts w:ascii="Times New Roman" w:hAnsi="Times New Roman"/>
+          <w:sz w:val="26"/>
+          <w:szCs w:val="26"/>
+        </w:rPr>
         <w:t xml:space="preserve"> </w:t>
       </w:r>
       <w:r>
-        <w:t>וָלָיְלָה</w:t>
-      </w:r>
-      <w:r>
-        <w:t>,‎ 'day and night,' will return in verse 9, but with inverted content: what now holds tears will then hold song. The same day-and-night frame, antithetical filling — one of the poem's most elegant structural seams.‏</w:t>
+        <w:rPr>
+          <w:rFonts w:ascii="Times New Roman" w:hAnsi="Times New Roman"/>
+          <w:sz w:val="26"/>
+          <w:szCs w:val="26"/>
+        </w:rPr>
+        <w:t>אֵפֶר</w:t>
+      </w:r>
+      <w:r>
+        <w:rPr>
+          <w:rFonts w:ascii="Times New Roman" w:hAnsi="Times New Roman"/>
+          <w:sz w:val="26"/>
+          <w:szCs w:val="26"/>
+        </w:rPr>
+        <w:t xml:space="preserve"> </w:t>
+      </w:r>
+      <w:r>
+        <w:rPr>
+          <w:rFonts w:ascii="Times New Roman" w:hAnsi="Times New Roman"/>
+          <w:sz w:val="26"/>
+          <w:szCs w:val="26"/>
+        </w:rPr>
+        <w:t>כַּלֶּחֶם</w:t>
+      </w:r>
+      <w:r>
+        <w:rPr>
+          <w:rFonts w:ascii="Times New Roman" w:hAnsi="Times New Roman"/>
+          <w:sz w:val="26"/>
+          <w:szCs w:val="26"/>
+        </w:rPr>
+        <w:t xml:space="preserve"> </w:t>
+      </w:r>
+      <w:r>
+        <w:rPr>
+          <w:rFonts w:ascii="Times New Roman" w:hAnsi="Times New Roman"/>
+          <w:sz w:val="26"/>
+          <w:szCs w:val="26"/>
+        </w:rPr>
+        <w:t>אָכָלְתִּי</w:t>
+      </w:r>
+      <w:r>
+        <w:rPr>
+          <w:rFonts w:ascii="Times New Roman" w:hAnsi="Times New Roman"/>
+          <w:sz w:val="26"/>
+          <w:szCs w:val="26"/>
+        </w:rPr>
+        <w:t xml:space="preserve"> </w:t>
+      </w:r>
+      <w:r>
+        <w:rPr>
+          <w:rFonts w:ascii="Times New Roman" w:hAnsi="Times New Roman"/>
+          <w:sz w:val="26"/>
+          <w:szCs w:val="26"/>
+        </w:rPr>
+        <w:t>וְשִׁקֻּוַי</w:t>
+      </w:r>
+      <w:r>
+        <w:rPr>
+          <w:rFonts w:ascii="Times New Roman" w:hAnsi="Times New Roman"/>
+          <w:sz w:val="26"/>
+          <w:szCs w:val="26"/>
+        </w:rPr>
+        <w:t xml:space="preserve"> </w:t>
+      </w:r>
+      <w:r>
+        <w:rPr>
+          <w:rFonts w:ascii="Times New Roman" w:hAnsi="Times New Roman"/>
+          <w:sz w:val="26"/>
+          <w:szCs w:val="26"/>
+        </w:rPr>
+        <w:t>בִּבְכִי</w:t>
+      </w:r>
+      <w:r>
+        <w:rPr>
+          <w:rFonts w:ascii="Times New Roman" w:hAnsi="Times New Roman"/>
+          <w:sz w:val="26"/>
+          <w:szCs w:val="26"/>
+        </w:rPr>
+        <w:t xml:space="preserve"> </w:t>
+      </w:r>
+      <w:r>
+        <w:rPr>
+          <w:rFonts w:ascii="Times New Roman" w:hAnsi="Times New Roman"/>
+          <w:sz w:val="26"/>
+          <w:szCs w:val="26"/>
+        </w:rPr>
+        <w:t>מָסָכְתִּי</w:t>
       </w:r>
     </w:p>
     <w:p>
@@ -2599,7 +2957,35 @@
         <w:pStyle w:val="BodySans"/>
       </w:pPr>
       <w:r>
+        <w:t>'For I have eaten ashes like bread and mixed my drink with tears' — ashes for food, tears for drink, the entire alimentary system colonized by grief.</w:t>
+      </w:r>
+    </w:p>
+    <w:p>
+      <w:pPr>
+        <w:pStyle w:val="BodySans"/>
+      </w:pPr>
+      <w:r>
         <w:lastRenderedPageBreak/>
+        <w:t xml:space="preserve">The temporal marker </w:t>
+      </w:r>
+      <w:r>
+        <w:t>יוֹמָם</w:t>
+      </w:r>
+      <w:r>
+        <w:t xml:space="preserve"> </w:t>
+      </w:r>
+      <w:r>
+        <w:t>וָלָיְלָה</w:t>
+      </w:r>
+      <w:r>
+        <w:t>,‎ 'day and night,' will return in verse 9, but with inverted content: what now holds tears will then hold song. The same day-and-night frame, antithetical filling — one of the poem's most elegant structural seams.‏</w:t>
+      </w:r>
+    </w:p>
+    <w:p>
+      <w:pPr>
+        <w:pStyle w:val="BodySans"/>
+      </w:pPr>
+      <w:r>
         <w:t xml:space="preserve">The taunt </w:t>
       </w:r>
       <w:r>
@@ -2905,43 +3291,115 @@
         <w:t>אֶשְׁפְּכָה</w:t>
       </w:r>
       <w:r>
-        <w:t xml:space="preserve"> / </w:t>
-      </w:r>
-      <w:r>
+        <w:t xml:space="preserve"> /</w:t>
+      </w:r>
+    </w:p>
+    <w:p>
+      <w:pPr>
+        <w:pStyle w:val="BodySans"/>
+        <w:bidi/>
+        <w:ind w:left="432" w:right="432"/>
+        <w:jc w:val="right"/>
+      </w:pPr>
+      <w:r>
+        <w:rPr>
+          <w:rFonts w:ascii="Times New Roman" w:hAnsi="Times New Roman"/>
+          <w:sz w:val="26"/>
+          <w:szCs w:val="26"/>
+        </w:rPr>
         <w:t>כִּי</w:t>
       </w:r>
       <w:r>
+        <w:rPr>
+          <w:rFonts w:ascii="Times New Roman" w:hAnsi="Times New Roman"/>
+          <w:sz w:val="26"/>
+          <w:szCs w:val="26"/>
+        </w:rPr>
         <w:t xml:space="preserve"> </w:t>
       </w:r>
       <w:r>
+        <w:rPr>
+          <w:rFonts w:ascii="Times New Roman" w:hAnsi="Times New Roman"/>
+          <w:sz w:val="26"/>
+          <w:szCs w:val="26"/>
+        </w:rPr>
         <w:t>בְלָעוּנוּ</w:t>
       </w:r>
       <w:r>
+        <w:rPr>
+          <w:rFonts w:ascii="Times New Roman" w:hAnsi="Times New Roman"/>
+          <w:sz w:val="26"/>
+          <w:szCs w:val="26"/>
+        </w:rPr>
         <w:t xml:space="preserve"> </w:t>
       </w:r>
       <w:r>
+        <w:rPr>
+          <w:rFonts w:ascii="Times New Roman" w:hAnsi="Times New Roman"/>
+          <w:sz w:val="26"/>
+          <w:szCs w:val="26"/>
+        </w:rPr>
         <w:t>זֵדִים</w:t>
       </w:r>
       <w:r>
+        <w:rPr>
+          <w:rFonts w:ascii="Times New Roman" w:hAnsi="Times New Roman"/>
+          <w:sz w:val="26"/>
+          <w:szCs w:val="26"/>
+        </w:rPr>
         <w:t xml:space="preserve"> </w:t>
       </w:r>
       <w:r>
+        <w:rPr>
+          <w:rFonts w:ascii="Times New Roman" w:hAnsi="Times New Roman"/>
+          <w:sz w:val="26"/>
+          <w:szCs w:val="26"/>
+        </w:rPr>
         <w:t>כְּעֻגָה</w:t>
       </w:r>
       <w:r>
+        <w:rPr>
+          <w:rFonts w:ascii="Times New Roman" w:hAnsi="Times New Roman"/>
+          <w:sz w:val="26"/>
+          <w:szCs w:val="26"/>
+        </w:rPr>
         <w:t xml:space="preserve"> </w:t>
       </w:r>
       <w:r>
+        <w:rPr>
+          <w:rFonts w:ascii="Times New Roman" w:hAnsi="Times New Roman"/>
+          <w:sz w:val="26"/>
+          <w:szCs w:val="26"/>
+        </w:rPr>
         <w:t>בְּלִי</w:t>
       </w:r>
       <w:r>
+        <w:rPr>
+          <w:rFonts w:ascii="Times New Roman" w:hAnsi="Times New Roman"/>
+          <w:sz w:val="26"/>
+          <w:szCs w:val="26"/>
+        </w:rPr>
         <w:t xml:space="preserve"> </w:t>
       </w:r>
       <w:r>
+        <w:rPr>
+          <w:rFonts w:ascii="Times New Roman" w:hAnsi="Times New Roman"/>
+          <w:sz w:val="26"/>
+          <w:szCs w:val="26"/>
+        </w:rPr>
         <w:t>הֲפוּכָה</w:t>
       </w:r>
-      <w:r>
-        <w:t>,‎ 'These things I remember and I pour out my soul upon myself, for the wanton ones consumed us like a cake not turned.' The payytan (liturgical poet) virtually quotes the psalm in order to narrate the execution of ten sages under Rome — converting personal exile-grief into national catastrophe.‏</w:t>
+    </w:p>
+    <w:p>
+      <w:pPr>
+        <w:pStyle w:val="BodySans"/>
+      </w:pPr>
+      <w:r>
+        <w:t xml:space="preserve">'These things I remember and I pour out my soul upon myself, for the wanton ones consumed us like a cake not turned.' The payytan virtually quotes the psalm in order to </w:t>
+      </w:r>
+      <w:r>
+        <w:lastRenderedPageBreak/>
+        <w:t>narrate the execution of ten sages under Rome — converting personal exile-grief into national catastrophe.</w:t>
       </w:r>
     </w:p>
     <w:p>
@@ -3024,7 +3482,6 @@
         <w:pStyle w:val="BodySans"/>
       </w:pPr>
       <w:r>
-        <w:lastRenderedPageBreak/>
         <w:t xml:space="preserve">The verb </w:t>
       </w:r>
       <w:r>
@@ -3109,7 +3566,7 @@
         <w:t>פָּנָיו</w:t>
       </w:r>
       <w:r>
-        <w:t>,‎ 'salvations of His face' — the third-person suffix. God, who has been 'You' since verse 2, becomes 'Him' at the very moment the psalmist attempts hope. As I noted in the essay, this grammatical distancing will be corrected in verse 12, but here it stands as evidence of how far the psalmist is from the assurance he commands.‏</w:t>
+        <w:t>,‎ 'salvations of His face' — the third-person suffix. God, who has been 'You' since verse 2, becomes 'Him' at the very moment the psalmist attempts hope. As noted above, this grammatical distancing will be corrected in verse 12, but here it stands as evidence of how far the psalmist is from the assurance he commands.‏</w:t>
       </w:r>
     </w:p>
     <w:p>
@@ -3225,7 +3682,7 @@
         <w:t>כְּשֶׁאֶזְכְּרָה</w:t>
       </w:r>
       <w:r>
-        <w:t>,‎ 'when I remember' — past experience of God's favor at the Jordan becomes the anchor for present survival.‏</w:t>
+        <w:t>,‎ 'when I remember' — memory of God from the land of Jordan becomes the anchor for present survival.‏</w:t>
       </w:r>
     </w:p>
     <w:p>
@@ -3248,6 +3705,7 @@
         <w:t xml:space="preserve"> </w:t>
       </w:r>
       <w:r>
+        <w:lastRenderedPageBreak/>
         <w:t>מִצְעָר</w:t>
       </w:r>
       <w:r>
@@ -3310,7 +3768,6 @@
         <w:pStyle w:val="BodySans"/>
       </w:pPr>
       <w:r>
-        <w:lastRenderedPageBreak/>
         <w:t xml:space="preserve">Mahmoud Darwish, writing from within the siege of Ramallah (2002), would place a similar speaker on a similar slope: </w:t>
       </w:r>
       <w:r>
@@ -3632,10 +4089,10 @@
         <w:t>עָבָרוּ</w:t>
       </w:r>
       <w:r>
-        <w:t>,‎ 'all Your breakers and Your waves have passed over me,' appears verbatim in Jonah 2:4, where the drowning prophet prays from inside the fish. The sharing is almost certainly deliberate — one text echoing the other — and the Jewish liturgical tradition exploits the connection: Jonah's prayer is the haftarah (prophetic reading) for Yom Kippur afternoon, meaning that congregations hear the psalmist's words in Jonah's mouth at the holiest moment of the liturgical ye</w:t>
-      </w:r>
-      <w:r>
-        <w:t>ar. The chaos-water, liturgically, belongs to the Day of Atonement.‏</w:t>
+        <w:t>,‎ 'all Your breakers and Your waves have passed over me,' reappears verbatim in Jonah 2:4, where the drowning prophet prays from inside the fish. The identical wording links the two prayers, and the Jewish liturgical tradition exploits the connection: Jonah's prayer is the haftarah (prophetic reading) for Yom Kippur afternoon, meaning that congregations hear the psalmist's words in Jonah's mouth at the holiest moment of the liturgical year. The chaos-water, liturg</w:t>
+      </w:r>
+      <w:r>
+        <w:t>ically, belongs to the Day of Atonement.‏</w:t>
       </w:r>
     </w:p>
     <w:p>
@@ -3652,7 +4109,11 @@
         <w:t>Moby-Dick</w:t>
       </w:r>
       <w:r>
-        <w:t xml:space="preserve">, Ch. 93). For the psalmist, body and soul drown together — and the drowning is </w:t>
+        <w:t xml:space="preserve">, Ch. 93). For the </w:t>
+      </w:r>
+      <w:r>
+        <w:lastRenderedPageBreak/>
+        <w:t xml:space="preserve">psalmist, body and soul drown together — and the drowning is </w:t>
       </w:r>
       <w:r>
         <w:rPr>
@@ -3744,7 +4205,6 @@
         <w:pStyle w:val="BodySans"/>
       </w:pPr>
       <w:r>
-        <w:lastRenderedPageBreak/>
         <w:t xml:space="preserve">This verse is the psalm's hinge, and it carries a secret. Within the so-called Elohistic Psalter (Psalms 42–83, a collection in which the generic divine name </w:t>
       </w:r>
       <w:r>
@@ -3792,13 +4252,13 @@
         <w:pStyle w:val="BodySans"/>
       </w:pPr>
       <w:r>
-        <w:t xml:space="preserve">A word-count of the unified Psalms 42–43 composition reveals that verse 9 falls at the exact mathematical center of the poem's 187 words — with the word </w:t>
+        <w:t xml:space="preserve">A word-count of the unified Psalms 42–43 composition places verse 9 near the center of the poem, with the word </w:t>
       </w:r>
       <w:r>
         <w:t>חַיָּי</w:t>
       </w:r>
       <w:r>
-        <w:t>,‎ 'my life,' as the literal middle word. Whether one attributes this to conscious scribal design or to the kind of intuitive balance that skilled poets achieve, the effect is architectural: the living God and the psalmist's own life stand at the poem's center of gravity.‏</w:t>
+        <w:t>,‎ 'my life,' close to that midpoint. Whether one attributes this to conscious scribal design or to the kind of intuitive balance that skilled poets achieve, the effect is architectural: the living God and the psalmist's own life stand near the poem's center of gravity.‏</w:t>
       </w:r>
     </w:p>
     <w:p>
@@ -3827,7 +4287,7 @@
         <w:t>dispatched</w:t>
       </w:r>
       <w:r>
-        <w:t xml:space="preserve">, a commissioned agent sent into the day. Elsewhere this construction appears in Psalm 44:5, </w:t>
+        <w:t xml:space="preserve">, a commissioned agent sent into the day. Elsewhere comparable language appears in Psalm 44:5, </w:t>
       </w:r>
       <w:r>
         <w:t>צַוֵּה</w:t>
@@ -3848,7 +4308,7 @@
         <w:t xml:space="preserve">,‎ 'command salvations for Jacob,' and Psalm 68:29, </w:t>
       </w:r>
       <w:r>
-        <w:t>צַוֵּה</w:t>
+        <w:t>צִוָּה</w:t>
       </w:r>
       <w:r>
         <w:t xml:space="preserve"> </w:t>
@@ -3863,7 +4323,7 @@
         <w:t>עֻזֶּךָ</w:t>
       </w:r>
       <w:r>
-        <w:t>,‎ 'command, O God, Your strength.' Divine love is not passive sentiment; it is deployed.‏</w:t>
+        <w:t>,‎ 'Your God has commanded your strength.' Divine love is not passive sentiment; it is deployed.‏</w:t>
       </w:r>
     </w:p>
     <w:p>
@@ -4017,7 +4477,7 @@
         <w:pStyle w:val="BodySans"/>
       </w:pPr>
       <w:r>
-        <w:t xml:space="preserve">The verse creates the psalm's sharpest oxymoron by placing </w:t>
+        <w:t xml:space="preserve">The verse creates the psalm's sharpest tension by placing </w:t>
       </w:r>
       <w:r>
         <w:t>סַלְעִי</w:t>
@@ -4026,7 +4486,7 @@
         <w:t xml:space="preserve">,‎ 'my rock/crag' (a specific geological formation denoting fortress-like reliability; cf. Ps 18:32, </w:t>
       </w:r>
       <w:r>
-        <w:t>מִי</w:t>
+        <w:t>וּמִי</w:t>
       </w:r>
       <w:r>
         <w:t xml:space="preserve"> </w:t>
@@ -4038,7 +4498,7 @@
         <w:t xml:space="preserve"> </w:t>
       </w:r>
       <w:r>
-        <w:t>בִּלְעֲדֵי</w:t>
+        <w:t>זוּלָתִי</w:t>
       </w:r>
       <w:r>
         <w:t xml:space="preserve"> </w:t>
@@ -4047,7 +4507,11 @@
         <w:t>אֱלֹקֵינוּ</w:t>
       </w:r>
       <w:r>
-        <w:t xml:space="preserve">,‎ 'who is a rock besides our God?'), immediately before </w:t>
+        <w:t xml:space="preserve">,‎ 'who </w:t>
+      </w:r>
+      <w:r>
+        <w:lastRenderedPageBreak/>
+        <w:t xml:space="preserve">is a rock besides our God?'), immediately before </w:t>
       </w:r>
       <w:r>
         <w:t>שְׁכַחְתָּנִי</w:t>
@@ -4121,14 +4585,10 @@
         <w:t xml:space="preserve"> </w:t>
       </w:r>
       <w:r>
-        <w:t>עֲזַבְתָּנִי</w:t>
-      </w:r>
-      <w:r>
-        <w:t xml:space="preserve">,‎ 'My God, my God, why have You forsaken me?' Both psalms </w:t>
-      </w:r>
-      <w:r>
-        <w:lastRenderedPageBreak/>
-        <w:t>employ direct confrontational address to God, and both place the question in the mouth of a speaker who has not stopped believing — the complaint itself is an act of faith, since one does not accuse a God one has abandoned.‏</w:t>
+        <w:t>עֲזַבְתָּנִי</w:t>
+      </w:r>
+      <w:r>
+        <w:t>,‎ 'My God, my God, why have You forsaken me?' Both psalms employ direct confrontational address to God, and both place the question in the mouth of a speaker who has not stopped believing — the complaint itself is an act of faith, since one does not accuse a God one has abandoned.‏</w:t>
       </w:r>
     </w:p>
     <w:p>
@@ -4492,6 +4952,7 @@
         <w:pStyle w:val="BodySans"/>
       </w:pPr>
       <w:r>
+        <w:lastRenderedPageBreak/>
         <w:t xml:space="preserve">Three things change between this refrain and its first occurrence in verse 6. First, a second explicit </w:t>
       </w:r>
       <w:r>
@@ -4518,7 +4979,6 @@
         <w:pStyle w:val="BodySans"/>
       </w:pPr>
       <w:r>
-        <w:lastRenderedPageBreak/>
         <w:t xml:space="preserve">Second, and most critically, the final phrase shifts from </w:t>
       </w:r>
       <w:r>
@@ -5042,35 +5502,53 @@
           <w:rFonts w:ascii="Aptos" w:hAnsi="Aptos"/>
           <w:b/>
         </w:rPr>
-        <w:t>Copy Editor</w:t>
+        <w:t>Citation Verifier Filter</w:t>
       </w:r>
       <w:r>
         <w:rPr>
           <w:rFonts w:ascii="Aptos" w:hAnsi="Aptos"/>
         </w:rPr>
-        <w:t>: gpt-5.4</w:t>
+        <w:t>: gpt-5.1</w:t>
       </w:r>
     </w:p>
     <w:p>
       <w:pPr>
-        <w:pStyle w:val="Heading3"/>
+        <w:pStyle w:val="SummaryText"/>
       </w:pPr>
       <w:r>
         <w:rPr>
           <w:rFonts w:ascii="Aptos" w:hAnsi="Aptos"/>
-        </w:rPr>
-        <w:t>Date Produced</w:t>
+          <w:b/>
+        </w:rPr>
+        <w:t>Copy Editor</w:t>
+      </w:r>
+      <w:r>
+        <w:rPr>
+          <w:rFonts w:ascii="Aptos" w:hAnsi="Aptos"/>
+        </w:rPr>
+        <w:t>: gpt-5.4</w:t>
       </w:r>
     </w:p>
     <w:p>
       <w:pPr>
+        <w:pStyle w:val="Heading3"/>
+      </w:pPr>
+      <w:r>
+        <w:rPr>
+          <w:rFonts w:ascii="Aptos" w:hAnsi="Aptos"/>
+        </w:rPr>
+        <w:t>Date Produced</w:t>
+      </w:r>
+    </w:p>
+    <w:p>
+      <w:pPr>
         <w:pStyle w:val="SummaryText"/>
       </w:pPr>
       <w:r>
         <w:rPr>
           <w:rFonts w:ascii="Aptos" w:hAnsi="Aptos"/>
         </w:rPr>
-        <w:t>March 15, 2026</w:t>
+        <w:t>March 18, 2026</w:t>
       </w:r>
     </w:p>
     <w:sectPr>
@@ -5336,31 +5814,31 @@
       </w:rPr>
     </w:lvl>
   </w:abstractNum>
-  <w:num w:numId="1" w16cid:durableId="1972857132">
+  <w:num w:numId="1" w16cid:durableId="172182419">
     <w:abstractNumId w:val="8"/>
   </w:num>
-  <w:num w:numId="2" w16cid:durableId="317272312">
+  <w:num w:numId="2" w16cid:durableId="2008436639">
     <w:abstractNumId w:val="6"/>
   </w:num>
-  <w:num w:numId="3" w16cid:durableId="1736314419">
+  <w:num w:numId="3" w16cid:durableId="1973055521">
     <w:abstractNumId w:val="5"/>
   </w:num>
-  <w:num w:numId="4" w16cid:durableId="1584754200">
+  <w:num w:numId="4" w16cid:durableId="594749729">
     <w:abstractNumId w:val="4"/>
   </w:num>
-  <w:num w:numId="5" w16cid:durableId="1675762314">
+  <w:num w:numId="5" w16cid:durableId="1502355195">
     <w:abstractNumId w:val="7"/>
   </w:num>
-  <w:num w:numId="6" w16cid:durableId="1919748424">
+  <w:num w:numId="6" w16cid:durableId="406610881">
     <w:abstractNumId w:val="3"/>
   </w:num>
-  <w:num w:numId="7" w16cid:durableId="1418404272">
+  <w:num w:numId="7" w16cid:durableId="1961692086">
     <w:abstractNumId w:val="2"/>
   </w:num>
-  <w:num w:numId="8" w16cid:durableId="749734247">
+  <w:num w:numId="8" w16cid:durableId="1852639909">
     <w:abstractNumId w:val="1"/>
   </w:num>
-  <w:num w:numId="9" w16cid:durableId="585773875">
+  <w:num w:numId="9" w16cid:durableId="1811822953">
     <w:abstractNumId w:val="0"/>
   </w:num>
 </w:numbering>

</xml_diff>